<commit_message>
auto: session 2026-08-04 11:01
Co-Authored-By: Claude Opus 4.8 (1M context) <noreply@anthropic.com>
</commit_message>
<xml_diff>
--- a/11-bao-gia-khach/Bao-gia-Booking-PR-BDS-4-bao-2026-08-04.docx
+++ b/11-bao-gia-khach/Bao-gia-Booking-PR-BDS-4-bao-2026-08-04.docx
@@ -257,6 +257,8 @@
               <w:rPr>
                 <w:b/>
                 <w:bCs/>
+                <w:i w:val="false"/>
+                <w:iCs w:val="false"/>
                 <w:color w:val="1C2035"/>
                 <w:sz w:val="19"/>
                 <w:szCs w:val="19"/>
@@ -284,11 +286,13 @@
               <w:rPr>
                 <w:b w:val="false"/>
                 <w:bCs w:val="false"/>
-                <w:color w:val="1C2035"/>
-                <w:sz w:val="19"/>
-                <w:szCs w:val="19"/>
-              </w:rPr>
-              <w:t xml:space="preserve">Doanh nghiệp viết 3 (tồn tại theo domain, không giới hạn thời hạn)</w:t>
+                <w:i w:val="false"/>
+                <w:iCs w:val="false"/>
+                <w:color w:val="1C2035"/>
+                <w:sz w:val="19"/>
+                <w:szCs w:val="19"/>
+              </w:rPr>
+              <w:t xml:space="preserve">Doanh nghiệp viết - tồn tại 24 tháng</w:t>
             </w:r>
           </w:p>
         </w:tc>
@@ -311,11 +315,13 @@
               <w:rPr>
                 <w:b w:val="false"/>
                 <w:bCs w:val="false"/>
-                <w:color w:val="1C2035"/>
-                <w:sz w:val="19"/>
-                <w:szCs w:val="19"/>
-              </w:rPr>
-              <w:t xml:space="preserve">Bài dưới 1.000 từ, dưới 3 ảnh, 2 link no</w:t>
+                <w:i w:val="false"/>
+                <w:iCs w:val="false"/>
+                <w:color w:val="1C2035"/>
+                <w:sz w:val="19"/>
+                <w:szCs w:val="19"/>
+              </w:rPr>
+              <w:t xml:space="preserve">Bài dưới 1.000 từ, dưới 3 ảnh, 2 link no · bài lưu trên site 24 tháng kể từ ngày đăng</w:t>
             </w:r>
           </w:p>
         </w:tc>
@@ -338,11 +344,13 @@
               <w:rPr>
                 <w:b/>
                 <w:bCs/>
-                <w:color w:val="1C2035"/>
-                <w:sz w:val="19"/>
-                <w:szCs w:val="19"/>
-              </w:rPr>
-              <w:t xml:space="preserve">15.759.000 đ</w:t>
+                <w:i w:val="false"/>
+                <w:iCs w:val="false"/>
+                <w:color w:val="1C2035"/>
+                <w:sz w:val="19"/>
+                <w:szCs w:val="19"/>
+              </w:rPr>
+              <w:t xml:space="preserve">12.154.000 đ</w:t>
             </w:r>
           </w:p>
         </w:tc>
@@ -368,6 +376,8 @@
               <w:rPr>
                 <w:b/>
                 <w:bCs/>
+                <w:i w:val="false"/>
+                <w:iCs w:val="false"/>
                 <w:color w:val="1C2035"/>
                 <w:sz w:val="19"/>
                 <w:szCs w:val="19"/>
@@ -396,6 +406,8 @@
               <w:rPr>
                 <w:b w:val="false"/>
                 <w:bCs w:val="false"/>
+                <w:i w:val="false"/>
+                <w:iCs w:val="false"/>
                 <w:color w:val="1C2035"/>
                 <w:sz w:val="19"/>
                 <w:szCs w:val="19"/>
@@ -424,6 +436,8 @@
               <w:rPr>
                 <w:b w:val="false"/>
                 <w:bCs w:val="false"/>
+                <w:i w:val="false"/>
+                <w:iCs w:val="false"/>
                 <w:color w:val="1C2035"/>
                 <w:sz w:val="19"/>
                 <w:szCs w:val="19"/>
@@ -452,6 +466,8 @@
               <w:rPr>
                 <w:b/>
                 <w:bCs/>
+                <w:i w:val="false"/>
+                <w:iCs w:val="false"/>
                 <w:color w:val="1C2035"/>
                 <w:sz w:val="19"/>
                 <w:szCs w:val="19"/>
@@ -481,6 +497,8 @@
               <w:rPr>
                 <w:b/>
                 <w:bCs/>
+                <w:i w:val="false"/>
+                <w:iCs w:val="false"/>
                 <w:color w:val="1C2035"/>
                 <w:sz w:val="19"/>
                 <w:szCs w:val="19"/>
@@ -508,6 +526,8 @@
               <w:rPr>
                 <w:b w:val="false"/>
                 <w:bCs w:val="false"/>
+                <w:i w:val="false"/>
+                <w:iCs w:val="false"/>
                 <w:color w:val="1C2035"/>
                 <w:sz w:val="19"/>
                 <w:szCs w:val="19"/>
@@ -535,6 +555,8 @@
               <w:rPr>
                 <w:b w:val="false"/>
                 <w:bCs w:val="false"/>
+                <w:i w:val="false"/>
+                <w:iCs w:val="false"/>
                 <w:color w:val="1C2035"/>
                 <w:sz w:val="19"/>
                 <w:szCs w:val="19"/>
@@ -562,6 +584,8 @@
               <w:rPr>
                 <w:b/>
                 <w:bCs/>
+                <w:i w:val="false"/>
+                <w:iCs w:val="false"/>
                 <w:color w:val="1C2035"/>
                 <w:sz w:val="19"/>
                 <w:szCs w:val="19"/>
@@ -592,6 +616,8 @@
               <w:rPr>
                 <w:b/>
                 <w:bCs/>
+                <w:i w:val="false"/>
+                <w:iCs w:val="false"/>
                 <w:color w:val="1C2035"/>
                 <w:sz w:val="19"/>
                 <w:szCs w:val="19"/>
@@ -620,6 +646,8 @@
               <w:rPr>
                 <w:b w:val="false"/>
                 <w:bCs w:val="false"/>
+                <w:i w:val="false"/>
+                <w:iCs w:val="false"/>
                 <w:color w:val="1C2035"/>
                 <w:sz w:val="19"/>
                 <w:szCs w:val="19"/>
@@ -648,6 +676,8 @@
               <w:rPr>
                 <w:b w:val="false"/>
                 <w:bCs w:val="false"/>
+                <w:i w:val="false"/>
+                <w:iCs w:val="false"/>
                 <w:color w:val="1C2035"/>
                 <w:sz w:val="19"/>
                 <w:szCs w:val="19"/>
@@ -676,6 +706,8 @@
               <w:rPr>
                 <w:b/>
                 <w:bCs/>
+                <w:i w:val="false"/>
+                <w:iCs w:val="false"/>
                 <w:color w:val="1C2035"/>
                 <w:sz w:val="19"/>
                 <w:szCs w:val="19"/>
@@ -739,7 +771,521 @@
                 <w:sz w:val="22"/>
                 <w:szCs w:val="22"/>
               </w:rPr>
-              <w:t xml:space="preserve">47.792.000 đ</w:t>
+              <w:t xml:space="preserve">44.187.000 đ</w:t>
+            </w:r>
+          </w:p>
+        </w:tc>
+      </w:tr>
+    </w:tbl>
+    <w:p>
+      <w:pPr>
+        <w:spacing w:after="100" w:before="320"/>
+      </w:pPr>
+      <w:r>
+        <w:rPr>
+          <w:b/>
+          <w:bCs/>
+          <w:color w:val="1C2035"/>
+          <w:sz w:val="23"/>
+          <w:szCs w:val="23"/>
+        </w:rPr>
+        <w:t xml:space="preserve">Lựa chọn thời hạn bài đăng - VnExpress</w:t>
+      </w:r>
+    </w:p>
+    <w:p>
+      <w:pPr>
+        <w:spacing w:after="220"/>
+      </w:pPr>
+      <w:r>
+        <w:rPr>
+          <w:b w:val="false"/>
+          <w:bCs w:val="false"/>
+          <w:i w:val="false"/>
+          <w:iCs w:val="false"/>
+          <w:color w:val="5B6675"/>
+          <w:sz w:val="19"/>
+          <w:szCs w:val="19"/>
+        </w:rPr>
+        <w:t xml:space="preserve">VnExpress có 3 gói theo thời gian bài được giữ trên site (sau mốc này báo có quyền gỡ bài, không ảnh hưởng bài đã đăng ở 3 báo còn lại). Bảng giá trên đang áp dụng gói 24 tháng — nếu cần rẻ hơn hoặc giữ bài lâu hơn, chọn 1 trong các mức sau:</w:t>
+      </w:r>
+    </w:p>
+    <w:tbl>
+      <w:tblPr>
+        <w:tblW w:type="dxa" w:w="10200"/>
+        <w:tblBorders>
+          <w:top w:val="single" w:color="auto" w:sz="4"/>
+          <w:left w:val="single" w:color="auto" w:sz="4"/>
+          <w:bottom w:val="single" w:color="auto" w:sz="4"/>
+          <w:right w:val="single" w:color="auto" w:sz="4"/>
+          <w:insideH w:val="single" w:color="auto" w:sz="4"/>
+          <w:insideV w:val="single" w:color="auto" w:sz="4"/>
+        </w:tblBorders>
+      </w:tblPr>
+      <w:tblGrid>
+        <w:gridCol w:w="2600"/>
+        <w:gridCol w:w="2200"/>
+        <w:gridCol w:w="2200"/>
+        <w:gridCol w:w="3200"/>
+      </w:tblGrid>
+      <w:tr>
+        <w:trPr>
+          <w:tblHeader/>
+        </w:trPr>
+        <w:tc>
+          <w:tcPr>
+            <w:tcW w:type="dxa" w:w="2600"/>
+            <w:shd w:fill="1C2035" w:val="clear"/>
+            <w:tcMar>
+              <w:top w:type="dxa" w:w="100"/>
+              <w:left w:type="dxa" w:w="100"/>
+              <w:bottom w:type="dxa" w:w="100"/>
+              <w:right w:type="dxa" w:w="100"/>
+            </w:tcMar>
+            <w:vAlign w:val="center"/>
+          </w:tcPr>
+          <w:p>
+            <w:r>
+              <w:rPr>
+                <w:b/>
+                <w:bCs/>
+                <w:color w:val="FFFFFF"/>
+                <w:sz w:val="20"/>
+                <w:szCs w:val="20"/>
+              </w:rPr>
+              <w:t xml:space="preserve">Thời hạn bài đăng</w:t>
+            </w:r>
+          </w:p>
+        </w:tc>
+        <w:tc>
+          <w:tcPr>
+            <w:tcW w:type="dxa" w:w="2200"/>
+            <w:shd w:fill="1C2035" w:val="clear"/>
+            <w:tcMar>
+              <w:top w:type="dxa" w:w="100"/>
+              <w:left w:type="dxa" w:w="100"/>
+              <w:bottom w:type="dxa" w:w="100"/>
+              <w:right w:type="dxa" w:w="100"/>
+            </w:tcMar>
+            <w:vAlign w:val="center"/>
+          </w:tcPr>
+          <w:p>
+            <w:r>
+              <w:rPr>
+                <w:b/>
+                <w:bCs/>
+                <w:color w:val="FFFFFF"/>
+                <w:sz w:val="20"/>
+                <w:szCs w:val="20"/>
+              </w:rPr>
+              <w:t xml:space="preserve">Đơn giá (chưa VAT)</w:t>
+            </w:r>
+          </w:p>
+        </w:tc>
+        <w:tc>
+          <w:tcPr>
+            <w:tcW w:type="dxa" w:w="2200"/>
+            <w:shd w:fill="1C2035" w:val="clear"/>
+            <w:tcMar>
+              <w:top w:type="dxa" w:w="100"/>
+              <w:left w:type="dxa" w:w="100"/>
+              <w:bottom w:type="dxa" w:w="100"/>
+              <w:right w:type="dxa" w:w="100"/>
+            </w:tcMar>
+            <w:vAlign w:val="center"/>
+          </w:tcPr>
+          <w:p>
+            <w:r>
+              <w:rPr>
+                <w:b/>
+                <w:bCs/>
+                <w:color w:val="FFFFFF"/>
+                <w:sz w:val="20"/>
+                <w:szCs w:val="20"/>
+              </w:rPr>
+              <w:t xml:space="preserve">Chênh so với 24 tháng</w:t>
+            </w:r>
+          </w:p>
+        </w:tc>
+        <w:tc>
+          <w:tcPr>
+            <w:tcW w:type="dxa" w:w="3200"/>
+            <w:shd w:fill="1C2035" w:val="clear"/>
+            <w:tcMar>
+              <w:top w:type="dxa" w:w="100"/>
+              <w:left w:type="dxa" w:w="100"/>
+              <w:bottom w:type="dxa" w:w="100"/>
+              <w:right w:type="dxa" w:w="100"/>
+            </w:tcMar>
+            <w:vAlign w:val="center"/>
+          </w:tcPr>
+          <w:p>
+            <w:r>
+              <w:rPr>
+                <w:b/>
+                <w:bCs/>
+                <w:color w:val="FFFFFF"/>
+                <w:sz w:val="20"/>
+                <w:szCs w:val="20"/>
+              </w:rPr>
+              <w:t xml:space="preserve">Phù hợp khi nào</w:t>
+            </w:r>
+          </w:p>
+        </w:tc>
+      </w:tr>
+      <w:tr>
+        <w:tc>
+          <w:tcPr>
+            <w:tcW w:type="dxa" w:w="2600"/>
+            <w:tcMar>
+              <w:top w:type="dxa" w:w="100"/>
+              <w:left w:type="dxa" w:w="100"/>
+              <w:bottom w:type="dxa" w:w="100"/>
+              <w:right w:type="dxa" w:w="100"/>
+            </w:tcMar>
+            <w:vAlign w:val="center"/>
+          </w:tcPr>
+          <w:p>
+            <w:pPr>
+              <w:jc w:val="left"/>
+            </w:pPr>
+            <w:r>
+              <w:rPr>
+                <w:b w:val="false"/>
+                <w:bCs w:val="false"/>
+                <w:i w:val="false"/>
+                <w:iCs w:val="false"/>
+                <w:color w:val="1C2035"/>
+                <w:sz w:val="19"/>
+                <w:szCs w:val="19"/>
+              </w:rPr>
+              <w:t xml:space="preserve">6 tháng</w:t>
+            </w:r>
+          </w:p>
+        </w:tc>
+        <w:tc>
+          <w:tcPr>
+            <w:tcW w:type="dxa" w:w="2200"/>
+            <w:tcMar>
+              <w:top w:type="dxa" w:w="100"/>
+              <w:left w:type="dxa" w:w="100"/>
+              <w:bottom w:type="dxa" w:w="100"/>
+              <w:right w:type="dxa" w:w="100"/>
+            </w:tcMar>
+            <w:vAlign w:val="center"/>
+          </w:tcPr>
+          <w:p>
+            <w:pPr>
+              <w:jc w:val="right"/>
+            </w:pPr>
+            <w:r>
+              <w:rPr>
+                <w:b/>
+                <w:bCs/>
+                <w:i w:val="false"/>
+                <w:iCs w:val="false"/>
+                <w:color w:val="1C2035"/>
+                <w:sz w:val="19"/>
+                <w:szCs w:val="19"/>
+              </w:rPr>
+              <w:t xml:space="preserve">8.034.000 đ</w:t>
+            </w:r>
+          </w:p>
+        </w:tc>
+        <w:tc>
+          <w:tcPr>
+            <w:tcW w:type="dxa" w:w="2200"/>
+            <w:tcMar>
+              <w:top w:type="dxa" w:w="100"/>
+              <w:left w:type="dxa" w:w="100"/>
+              <w:bottom w:type="dxa" w:w="100"/>
+              <w:right w:type="dxa" w:w="100"/>
+            </w:tcMar>
+            <w:vAlign w:val="center"/>
+          </w:tcPr>
+          <w:p>
+            <w:pPr>
+              <w:jc w:val="center"/>
+            </w:pPr>
+            <w:r>
+              <w:rPr>
+                <w:b w:val="false"/>
+                <w:bCs w:val="false"/>
+                <w:i w:val="false"/>
+                <w:iCs w:val="false"/>
+                <w:color w:val="1C2035"/>
+                <w:sz w:val="19"/>
+                <w:szCs w:val="19"/>
+              </w:rPr>
+              <w:t xml:space="preserve">-4.120.000 đ</w:t>
+            </w:r>
+          </w:p>
+        </w:tc>
+        <w:tc>
+          <w:tcPr>
+            <w:tcW w:type="dxa" w:w="3200"/>
+            <w:tcMar>
+              <w:top w:type="dxa" w:w="100"/>
+              <w:left w:type="dxa" w:w="100"/>
+              <w:bottom w:type="dxa" w:w="100"/>
+              <w:right w:type="dxa" w:w="100"/>
+            </w:tcMar>
+            <w:vAlign w:val="center"/>
+          </w:tcPr>
+          <w:p>
+            <w:pPr>
+              <w:jc w:val="left"/>
+            </w:pPr>
+            <w:r>
+              <w:rPr>
+                <w:b w:val="false"/>
+                <w:bCs w:val="false"/>
+                <w:i w:val="false"/>
+                <w:iCs w:val="false"/>
+                <w:color w:val="1C2035"/>
+                <w:sz w:val="18"/>
+                <w:szCs w:val="18"/>
+              </w:rPr>
+              <w:t xml:space="preserve">Rẻ nhất, phù hợp PR ngắn hạn (mở bán đợt 1, sự kiện...)</w:t>
+            </w:r>
+          </w:p>
+        </w:tc>
+      </w:tr>
+      <w:tr>
+        <w:tc>
+          <w:tcPr>
+            <w:tcW w:type="dxa" w:w="2600"/>
+            <w:shd w:fill="F1F5F9" w:val="clear"/>
+            <w:tcMar>
+              <w:top w:type="dxa" w:w="100"/>
+              <w:left w:type="dxa" w:w="100"/>
+              <w:bottom w:type="dxa" w:w="100"/>
+              <w:right w:type="dxa" w:w="100"/>
+            </w:tcMar>
+            <w:vAlign w:val="center"/>
+          </w:tcPr>
+          <w:p>
+            <w:pPr>
+              <w:jc w:val="left"/>
+            </w:pPr>
+            <w:r>
+              <w:rPr>
+                <w:b/>
+                <w:bCs/>
+                <w:i w:val="false"/>
+                <w:iCs w:val="false"/>
+                <w:color w:val="1C2035"/>
+                <w:sz w:val="19"/>
+                <w:szCs w:val="19"/>
+              </w:rPr>
+              <w:t xml:space="preserve">24 tháng (đề xuất)</w:t>
+            </w:r>
+          </w:p>
+        </w:tc>
+        <w:tc>
+          <w:tcPr>
+            <w:tcW w:type="dxa" w:w="2200"/>
+            <w:shd w:fill="F1F5F9" w:val="clear"/>
+            <w:tcMar>
+              <w:top w:type="dxa" w:w="100"/>
+              <w:left w:type="dxa" w:w="100"/>
+              <w:bottom w:type="dxa" w:w="100"/>
+              <w:right w:type="dxa" w:w="100"/>
+            </w:tcMar>
+            <w:vAlign w:val="center"/>
+          </w:tcPr>
+          <w:p>
+            <w:pPr>
+              <w:jc w:val="right"/>
+            </w:pPr>
+            <w:r>
+              <w:rPr>
+                <w:b/>
+                <w:bCs/>
+                <w:i w:val="false"/>
+                <w:iCs w:val="false"/>
+                <w:color w:val="1C2035"/>
+                <w:sz w:val="19"/>
+                <w:szCs w:val="19"/>
+              </w:rPr>
+              <w:t xml:space="preserve">12.154.000 đ</w:t>
+            </w:r>
+          </w:p>
+        </w:tc>
+        <w:tc>
+          <w:tcPr>
+            <w:tcW w:type="dxa" w:w="2200"/>
+            <w:shd w:fill="F1F5F9" w:val="clear"/>
+            <w:tcMar>
+              <w:top w:type="dxa" w:w="100"/>
+              <w:left w:type="dxa" w:w="100"/>
+              <w:bottom w:type="dxa" w:w="100"/>
+              <w:right w:type="dxa" w:w="100"/>
+            </w:tcMar>
+            <w:vAlign w:val="center"/>
+          </w:tcPr>
+          <w:p>
+            <w:pPr>
+              <w:jc w:val="center"/>
+            </w:pPr>
+            <w:r>
+              <w:rPr>
+                <w:b w:val="false"/>
+                <w:bCs w:val="false"/>
+                <w:i w:val="false"/>
+                <w:iCs w:val="false"/>
+                <w:color w:val="1C2035"/>
+                <w:sz w:val="19"/>
+                <w:szCs w:val="19"/>
+              </w:rPr>
+              <w:t xml:space="preserve">—</w:t>
+            </w:r>
+          </w:p>
+        </w:tc>
+        <w:tc>
+          <w:tcPr>
+            <w:tcW w:type="dxa" w:w="3200"/>
+            <w:shd w:fill="F1F5F9" w:val="clear"/>
+            <w:tcMar>
+              <w:top w:type="dxa" w:w="100"/>
+              <w:left w:type="dxa" w:w="100"/>
+              <w:bottom w:type="dxa" w:w="100"/>
+              <w:right w:type="dxa" w:w="100"/>
+            </w:tcMar>
+            <w:vAlign w:val="center"/>
+          </w:tcPr>
+          <w:p>
+            <w:pPr>
+              <w:jc w:val="left"/>
+            </w:pPr>
+            <w:r>
+              <w:rPr>
+                <w:b w:val="false"/>
+                <w:bCs w:val="false"/>
+                <w:i w:val="false"/>
+                <w:iCs w:val="false"/>
+                <w:color w:val="1C2035"/>
+                <w:sz w:val="18"/>
+                <w:szCs w:val="18"/>
+              </w:rPr>
+              <w:t xml:space="preserve">Cân bằng chi phí - thời gian, đủ dài cho cả giai đoạn mở bán dự án</w:t>
+            </w:r>
+          </w:p>
+        </w:tc>
+      </w:tr>
+      <w:tr>
+        <w:tc>
+          <w:tcPr>
+            <w:tcW w:type="dxa" w:w="2600"/>
+            <w:tcMar>
+              <w:top w:type="dxa" w:w="100"/>
+              <w:left w:type="dxa" w:w="100"/>
+              <w:bottom w:type="dxa" w:w="100"/>
+              <w:right w:type="dxa" w:w="100"/>
+            </w:tcMar>
+            <w:vAlign w:val="center"/>
+          </w:tcPr>
+          <w:p>
+            <w:pPr>
+              <w:jc w:val="left"/>
+            </w:pPr>
+            <w:r>
+              <w:rPr>
+                <w:b w:val="false"/>
+                <w:bCs w:val="false"/>
+                <w:i w:val="false"/>
+                <w:iCs w:val="false"/>
+                <w:color w:val="1C2035"/>
+                <w:sz w:val="19"/>
+                <w:szCs w:val="19"/>
+              </w:rPr>
+              <w:t xml:space="preserve">Vĩnh viễn (tồn tại theo domain)</w:t>
+            </w:r>
+          </w:p>
+        </w:tc>
+        <w:tc>
+          <w:tcPr>
+            <w:tcW w:type="dxa" w:w="2200"/>
+            <w:tcMar>
+              <w:top w:type="dxa" w:w="100"/>
+              <w:left w:type="dxa" w:w="100"/>
+              <w:bottom w:type="dxa" w:w="100"/>
+              <w:right w:type="dxa" w:w="100"/>
+            </w:tcMar>
+            <w:vAlign w:val="center"/>
+          </w:tcPr>
+          <w:p>
+            <w:pPr>
+              <w:jc w:val="right"/>
+            </w:pPr>
+            <w:r>
+              <w:rPr>
+                <w:b/>
+                <w:bCs/>
+                <w:i w:val="false"/>
+                <w:iCs w:val="false"/>
+                <w:color w:val="1C2035"/>
+                <w:sz w:val="19"/>
+                <w:szCs w:val="19"/>
+              </w:rPr>
+              <w:t xml:space="preserve">15.759.000 đ</w:t>
+            </w:r>
+          </w:p>
+        </w:tc>
+        <w:tc>
+          <w:tcPr>
+            <w:tcW w:type="dxa" w:w="2200"/>
+            <w:tcMar>
+              <w:top w:type="dxa" w:w="100"/>
+              <w:left w:type="dxa" w:w="100"/>
+              <w:bottom w:type="dxa" w:w="100"/>
+              <w:right w:type="dxa" w:w="100"/>
+            </w:tcMar>
+            <w:vAlign w:val="center"/>
+          </w:tcPr>
+          <w:p>
+            <w:pPr>
+              <w:jc w:val="center"/>
+            </w:pPr>
+            <w:r>
+              <w:rPr>
+                <w:b w:val="false"/>
+                <w:bCs w:val="false"/>
+                <w:i w:val="false"/>
+                <w:iCs w:val="false"/>
+                <w:color w:val="1C2035"/>
+                <w:sz w:val="19"/>
+                <w:szCs w:val="19"/>
+              </w:rPr>
+              <w:t xml:space="preserve">+3.605.000 đ</w:t>
+            </w:r>
+          </w:p>
+        </w:tc>
+        <w:tc>
+          <w:tcPr>
+            <w:tcW w:type="dxa" w:w="3200"/>
+            <w:tcMar>
+              <w:top w:type="dxa" w:w="100"/>
+              <w:left w:type="dxa" w:w="100"/>
+              <w:bottom w:type="dxa" w:w="100"/>
+              <w:right w:type="dxa" w:w="100"/>
+            </w:tcMar>
+            <w:vAlign w:val="center"/>
+          </w:tcPr>
+          <w:p>
+            <w:pPr>
+              <w:jc w:val="left"/>
+            </w:pPr>
+            <w:r>
+              <w:rPr>
+                <w:b w:val="false"/>
+                <w:bCs w:val="false"/>
+                <w:i w:val="false"/>
+                <w:iCs w:val="false"/>
+                <w:color w:val="1C2035"/>
+                <w:sz w:val="18"/>
+                <w:szCs w:val="18"/>
+              </w:rPr>
+              <w:t xml:space="preserve">Bài không bị gỡ trừ khi VnExpress ngừng hoạt động - tối ưu cho SEO/backlink lâu dài</w:t>
             </w:r>
           </w:p>
         </w:tc>

</xml_diff>

<commit_message>
auto: session 2026-08-04 11:07
Co-Authored-By: Claude Opus 4.8 (1M context) <noreply@anthropic.com>
</commit_message>
<xml_diff>
--- a/11-bao-gia-khach/Bao-gia-Booking-PR-BDS-4-bao-2026-08-04.docx
+++ b/11-bao-gia-khach/Bao-gia-Booking-PR-BDS-4-bao-2026-08-04.docx
@@ -60,7 +60,7 @@
           <w:sz w:val="22"/>
           <w:szCs w:val="22"/>
         </w:rPr>
-        <w:t xml:space="preserve">Dự án: Bất động sản</w:t>
+        <w:t xml:space="preserve">Dự án: Bất động sản  ·  Gói tối ưu chi phí</w:t>
       </w:r>
     </w:p>
     <w:p>
@@ -111,7 +111,7 @@
           <w:sz w:val="20"/>
           <w:szCs w:val="20"/>
         </w:rPr>
-        <w:t xml:space="preserve">Viết và đăng bài PR cho dự án bất động sản trên 4 đầu báo điện tử: VnExpress, VietNamNet, Dân Trí, CafeF. Vị trí đề xuất bên dưới thuộc chuyên mục Kinh doanh / Bất động sản, phù hợp giới thiệu dự án và mở bán.</w:t>
+        <w:t xml:space="preserve">Viết và đăng bài PR cho dự án bất động sản trên 4 đầu báo điện tử: VnExpress, VietNamNet, Dân Trí, CafeF. Vị trí bên dưới đã chọn mức chi phí tối ưu — chuyên mục/tiểu mục phổ biến, phù hợp giới thiệu dự án và mở bán, không cần vị trí nổi bật trang chủ.</w:t>
       </w:r>
     </w:p>
     <w:tbl>
@@ -292,7 +292,7 @@
                 <w:sz w:val="19"/>
                 <w:szCs w:val="19"/>
               </w:rPr>
-              <w:t xml:space="preserve">Doanh nghiệp viết - tồn tại 24 tháng</w:t>
+              <w:t xml:space="preserve">Doanh nghiệp viết - tồn tại 6 tháng</w:t>
             </w:r>
           </w:p>
         </w:tc>
@@ -321,7 +321,7 @@
                 <w:sz w:val="19"/>
                 <w:szCs w:val="19"/>
               </w:rPr>
-              <w:t xml:space="preserve">Bài dưới 1.000 từ, dưới 3 ảnh, 2 link no · bài lưu trên site 24 tháng kể từ ngày đăng</w:t>
+              <w:t xml:space="preserve">Bài dưới 1.000 từ, dưới 3 ảnh, 2 link no · bài lưu trên site 6 tháng kể từ ngày đăng</w:t>
             </w:r>
           </w:p>
         </w:tc>
@@ -350,7 +350,7 @@
                 <w:sz w:val="19"/>
                 <w:szCs w:val="19"/>
               </w:rPr>
-              <w:t xml:space="preserve">12.154.000 đ</w:t>
+              <w:t xml:space="preserve">8.034.000 đ</w:t>
             </w:r>
           </w:p>
         </w:tc>
@@ -412,7 +412,7 @@
                 <w:sz w:val="19"/>
                 <w:szCs w:val="19"/>
               </w:rPr>
-              <w:t xml:space="preserve">Top 9 chuyên mục</w:t>
+              <w:t xml:space="preserve">Tiểu mục</w:t>
             </w:r>
           </w:p>
         </w:tc>
@@ -442,7 +442,7 @@
                 <w:sz w:val="19"/>
                 <w:szCs w:val="19"/>
               </w:rPr>
-              <w:t xml:space="preserve">Bài dưới 1.000 từ, 5 ảnh chất lượng cao, không chèn link</w:t>
+              <w:t xml:space="preserve">Bài 1.000 chữ, 5 ảnh chất lượng cao, không chèn link</w:t>
             </w:r>
           </w:p>
         </w:tc>
@@ -472,7 +472,7 @@
                 <w:sz w:val="19"/>
                 <w:szCs w:val="19"/>
               </w:rPr>
-              <w:t xml:space="preserve">10.506.000 đ</w:t>
+              <w:t xml:space="preserve">5.026.000 đ</w:t>
             </w:r>
           </w:p>
         </w:tc>
@@ -652,7 +652,7 @@
                 <w:sz w:val="19"/>
                 <w:szCs w:val="19"/>
               </w:rPr>
-              <w:t xml:space="preserve">Chuyên mục 1 (Bất động sản, Doanh nghiệp, Tài chính - Ngân hàng, Chứng khoán, Smart Money)</w:t>
+              <w:t xml:space="preserve">Tin doanh nghiệp</w:t>
             </w:r>
           </w:p>
         </w:tc>
@@ -682,7 +682,7 @@
                 <w:sz w:val="19"/>
                 <w:szCs w:val="19"/>
               </w:rPr>
-              <w:t xml:space="preserve">Bài dưới 1.000 từ, dưới 5 ảnh</w:t>
+              <w:t xml:space="preserve">Bài 1.000 chữ, 5 ảnh, 1 link no (mua thêm link 500k/link)</w:t>
             </w:r>
           </w:p>
         </w:tc>
@@ -712,7 +712,7 @@
                 <w:sz w:val="19"/>
                 <w:szCs w:val="19"/>
               </w:rPr>
-              <w:t xml:space="preserve">10.712.000 đ</w:t>
+              <w:t xml:space="preserve">6.592.000 đ</w:t>
             </w:r>
           </w:p>
         </w:tc>
@@ -771,7 +771,7 @@
                 <w:sz w:val="22"/>
                 <w:szCs w:val="22"/>
               </w:rPr>
-              <w:t xml:space="preserve">44.187.000 đ</w:t>
+              <w:t xml:space="preserve">30.467.000 đ</w:t>
             </w:r>
           </w:p>
         </w:tc>
@@ -779,7 +779,7 @@
     </w:tbl>
     <w:p>
       <w:pPr>
-        <w:spacing w:after="100" w:before="320"/>
+        <w:spacing w:after="100" w:before="300"/>
       </w:pPr>
       <w:r>
         <w:rPr>
@@ -789,7 +789,7 @@
           <w:sz w:val="23"/>
           <w:szCs w:val="23"/>
         </w:rPr>
-        <w:t xml:space="preserve">Lựa chọn thời hạn bài đăng - VnExpress</w:t>
+        <w:t xml:space="preserve">Thời hạn bài đăng VnExpress - có thể chọn thêm</w:t>
       </w:r>
     </w:p>
     <w:p>
@@ -806,7 +806,7 @@
           <w:sz w:val="19"/>
           <w:szCs w:val="19"/>
         </w:rPr>
-        <w:t xml:space="preserve">VnExpress có 3 gói theo thời gian bài được giữ trên site (sau mốc này báo có quyền gỡ bài, không ảnh hưởng bài đã đăng ở 3 báo còn lại). Bảng giá trên đang áp dụng gói 24 tháng — nếu cần rẻ hơn hoặc giữ bài lâu hơn, chọn 1 trong các mức sau:</w:t>
+        <w:t xml:space="preserve">Bài trên VnExpress giữ 6 tháng trên site theo báo giá mặc định (không ảnh hưởng 3 báo còn lại — 3 báo này bài lưu lâu dài). Cần giữ bài lâu hơn để tăng hiệu quả SEO/backlink có thể nâng gói:</w:t>
       </w:r>
     </w:p>
     <w:tbl>
@@ -822,10 +822,8 @@
         </w:tblBorders>
       </w:tblPr>
       <w:tblGrid>
-        <w:gridCol w:w="2600"/>
-        <w:gridCol w:w="2200"/>
-        <w:gridCol w:w="2200"/>
-        <w:gridCol w:w="3200"/>
+        <w:gridCol w:w="5000"/>
+        <w:gridCol w:w="5200"/>
       </w:tblGrid>
       <w:tr>
         <w:trPr>
@@ -833,7 +831,7 @@
         </w:trPr>
         <w:tc>
           <w:tcPr>
-            <w:tcW w:type="dxa" w:w="2600"/>
+            <w:tcW w:type="dxa" w:w="5000"/>
             <w:shd w:fill="1C2035" w:val="clear"/>
             <w:tcMar>
               <w:top w:type="dxa" w:w="100"/>
@@ -852,13 +850,13 @@
                 <w:sz w:val="20"/>
                 <w:szCs w:val="20"/>
               </w:rPr>
-              <w:t xml:space="preserve">Thời hạn bài đăng</w:t>
-            </w:r>
-          </w:p>
-        </w:tc>
-        <w:tc>
-          <w:tcPr>
-            <w:tcW w:type="dxa" w:w="2200"/>
+              <w:t xml:space="preserve">Thời hạn bài đăng VnExpress</w:t>
+            </w:r>
+          </w:p>
+        </w:tc>
+        <w:tc>
+          <w:tcPr>
+            <w:tcW w:type="dxa" w:w="5200"/>
             <w:shd w:fill="1C2035" w:val="clear"/>
             <w:tcMar>
               <w:top w:type="dxa" w:w="100"/>
@@ -881,61 +879,72 @@
             </w:r>
           </w:p>
         </w:tc>
-        <w:tc>
-          <w:tcPr>
-            <w:tcW w:type="dxa" w:w="2200"/>
-            <w:shd w:fill="1C2035" w:val="clear"/>
-            <w:tcMar>
-              <w:top w:type="dxa" w:w="100"/>
-              <w:left w:type="dxa" w:w="100"/>
-              <w:bottom w:type="dxa" w:w="100"/>
-              <w:right w:type="dxa" w:w="100"/>
-            </w:tcMar>
-            <w:vAlign w:val="center"/>
-          </w:tcPr>
-          <w:p>
-            <w:r>
-              <w:rPr>
-                <w:b/>
-                <w:bCs/>
-                <w:color w:val="FFFFFF"/>
-                <w:sz w:val="20"/>
-                <w:szCs w:val="20"/>
-              </w:rPr>
-              <w:t xml:space="preserve">Chênh so với 24 tháng</w:t>
-            </w:r>
-          </w:p>
-        </w:tc>
-        <w:tc>
-          <w:tcPr>
-            <w:tcW w:type="dxa" w:w="3200"/>
-            <w:shd w:fill="1C2035" w:val="clear"/>
-            <w:tcMar>
-              <w:top w:type="dxa" w:w="100"/>
-              <w:left w:type="dxa" w:w="100"/>
-              <w:bottom w:type="dxa" w:w="100"/>
-              <w:right w:type="dxa" w:w="100"/>
-            </w:tcMar>
-            <w:vAlign w:val="center"/>
-          </w:tcPr>
-          <w:p>
-            <w:r>
-              <w:rPr>
-                <w:b/>
-                <w:bCs/>
-                <w:color w:val="FFFFFF"/>
-                <w:sz w:val="20"/>
-                <w:szCs w:val="20"/>
-              </w:rPr>
-              <w:t xml:space="preserve">Phù hợp khi nào</w:t>
-            </w:r>
-          </w:p>
-        </w:tc>
       </w:tr>
       <w:tr>
         <w:tc>
           <w:tcPr>
-            <w:tcW w:type="dxa" w:w="2600"/>
+            <w:tcW w:type="dxa" w:w="5000"/>
+            <w:tcMar>
+              <w:top w:type="dxa" w:w="100"/>
+              <w:left w:type="dxa" w:w="100"/>
+              <w:bottom w:type="dxa" w:w="100"/>
+              <w:right w:type="dxa" w:w="100"/>
+            </w:tcMar>
+            <w:vAlign w:val="center"/>
+          </w:tcPr>
+          <w:p>
+            <w:pPr>
+              <w:jc w:val="left"/>
+            </w:pPr>
+            <w:r>
+              <w:rPr>
+                <w:b/>
+                <w:bCs/>
+                <w:i w:val="false"/>
+                <w:iCs w:val="false"/>
+                <w:color w:val="1C2035"/>
+                <w:sz w:val="19"/>
+                <w:szCs w:val="19"/>
+              </w:rPr>
+              <w:t xml:space="preserve">6 tháng (mặc định)</w:t>
+            </w:r>
+          </w:p>
+        </w:tc>
+        <w:tc>
+          <w:tcPr>
+            <w:tcW w:type="dxa" w:w="5200"/>
+            <w:tcMar>
+              <w:top w:type="dxa" w:w="100"/>
+              <w:left w:type="dxa" w:w="100"/>
+              <w:bottom w:type="dxa" w:w="100"/>
+              <w:right w:type="dxa" w:w="100"/>
+            </w:tcMar>
+            <w:vAlign w:val="center"/>
+          </w:tcPr>
+          <w:p>
+            <w:pPr>
+              <w:jc w:val="right"/>
+            </w:pPr>
+            <w:r>
+              <w:rPr>
+                <w:b/>
+                <w:bCs/>
+                <w:i w:val="false"/>
+                <w:iCs w:val="false"/>
+                <w:color w:val="1C2035"/>
+                <w:sz w:val="19"/>
+                <w:szCs w:val="19"/>
+              </w:rPr>
+              <w:t xml:space="preserve">8.034.000 đ</w:t>
+            </w:r>
+          </w:p>
+        </w:tc>
+      </w:tr>
+      <w:tr>
+        <w:tc>
+          <w:tcPr>
+            <w:tcW w:type="dxa" w:w="5000"/>
+            <w:shd w:fill="F1F5F9" w:val="clear"/>
             <w:tcMar>
               <w:top w:type="dxa" w:w="100"/>
               <w:left w:type="dxa" w:w="100"/>
@@ -958,13 +967,14 @@
                 <w:sz w:val="19"/>
                 <w:szCs w:val="19"/>
               </w:rPr>
-              <w:t xml:space="preserve">6 tháng</w:t>
-            </w:r>
-          </w:p>
-        </w:tc>
-        <w:tc>
-          <w:tcPr>
-            <w:tcW w:type="dxa" w:w="2200"/>
+              <w:t xml:space="preserve">24 tháng</w:t>
+            </w:r>
+          </w:p>
+        </w:tc>
+        <w:tc>
+          <w:tcPr>
+            <w:tcW w:type="dxa" w:w="5200"/>
+            <w:shd w:fill="F1F5F9" w:val="clear"/>
             <w:tcMar>
               <w:top w:type="dxa" w:w="100"/>
               <w:left w:type="dxa" w:w="100"/>
@@ -987,24 +997,26 @@
                 <w:sz w:val="19"/>
                 <w:szCs w:val="19"/>
               </w:rPr>
-              <w:t xml:space="preserve">8.034.000 đ</w:t>
-            </w:r>
-          </w:p>
-        </w:tc>
-        <w:tc>
-          <w:tcPr>
-            <w:tcW w:type="dxa" w:w="2200"/>
-            <w:tcMar>
-              <w:top w:type="dxa" w:w="100"/>
-              <w:left w:type="dxa" w:w="100"/>
-              <w:bottom w:type="dxa" w:w="100"/>
-              <w:right w:type="dxa" w:w="100"/>
-            </w:tcMar>
-            <w:vAlign w:val="center"/>
-          </w:tcPr>
-          <w:p>
-            <w:pPr>
-              <w:jc w:val="center"/>
+              <w:t xml:space="preserve">12.154.000 đ</w:t>
+            </w:r>
+          </w:p>
+        </w:tc>
+      </w:tr>
+      <w:tr>
+        <w:tc>
+          <w:tcPr>
+            <w:tcW w:type="dxa" w:w="5000"/>
+            <w:tcMar>
+              <w:top w:type="dxa" w:w="100"/>
+              <w:left w:type="dxa" w:w="100"/>
+              <w:bottom w:type="dxa" w:w="100"/>
+              <w:right w:type="dxa" w:w="100"/>
+            </w:tcMar>
+            <w:vAlign w:val="center"/>
+          </w:tcPr>
+          <w:p>
+            <w:pPr>
+              <w:jc w:val="left"/>
             </w:pPr>
             <w:r>
               <w:rPr>
@@ -1016,75 +1028,13 @@
                 <w:sz w:val="19"/>
                 <w:szCs w:val="19"/>
               </w:rPr>
-              <w:t xml:space="preserve">-4.120.000 đ</w:t>
-            </w:r>
-          </w:p>
-        </w:tc>
-        <w:tc>
-          <w:tcPr>
-            <w:tcW w:type="dxa" w:w="3200"/>
-            <w:tcMar>
-              <w:top w:type="dxa" w:w="100"/>
-              <w:left w:type="dxa" w:w="100"/>
-              <w:bottom w:type="dxa" w:w="100"/>
-              <w:right w:type="dxa" w:w="100"/>
-            </w:tcMar>
-            <w:vAlign w:val="center"/>
-          </w:tcPr>
-          <w:p>
-            <w:pPr>
-              <w:jc w:val="left"/>
-            </w:pPr>
-            <w:r>
-              <w:rPr>
-                <w:b w:val="false"/>
-                <w:bCs w:val="false"/>
-                <w:i w:val="false"/>
-                <w:iCs w:val="false"/>
-                <w:color w:val="1C2035"/>
-                <w:sz w:val="18"/>
-                <w:szCs w:val="18"/>
-              </w:rPr>
-              <w:t xml:space="preserve">Rẻ nhất, phù hợp PR ngắn hạn (mở bán đợt 1, sự kiện...)</w:t>
-            </w:r>
-          </w:p>
-        </w:tc>
-      </w:tr>
-      <w:tr>
-        <w:tc>
-          <w:tcPr>
-            <w:tcW w:type="dxa" w:w="2600"/>
-            <w:shd w:fill="F1F5F9" w:val="clear"/>
-            <w:tcMar>
-              <w:top w:type="dxa" w:w="100"/>
-              <w:left w:type="dxa" w:w="100"/>
-              <w:bottom w:type="dxa" w:w="100"/>
-              <w:right w:type="dxa" w:w="100"/>
-            </w:tcMar>
-            <w:vAlign w:val="center"/>
-          </w:tcPr>
-          <w:p>
-            <w:pPr>
-              <w:jc w:val="left"/>
-            </w:pPr>
-            <w:r>
-              <w:rPr>
-                <w:b/>
-                <w:bCs/>
-                <w:i w:val="false"/>
-                <w:iCs w:val="false"/>
-                <w:color w:val="1C2035"/>
-                <w:sz w:val="19"/>
-                <w:szCs w:val="19"/>
-              </w:rPr>
-              <w:t xml:space="preserve">24 tháng (đề xuất)</w:t>
-            </w:r>
-          </w:p>
-        </w:tc>
-        <w:tc>
-          <w:tcPr>
-            <w:tcW w:type="dxa" w:w="2200"/>
-            <w:shd w:fill="F1F5F9" w:val="clear"/>
+              <w:t xml:space="preserve">Vĩnh viễn (tồn tại theo domain)</w:t>
+            </w:r>
+          </w:p>
+        </w:tc>
+        <w:tc>
+          <w:tcPr>
+            <w:tcW w:type="dxa" w:w="5200"/>
             <w:tcMar>
               <w:top w:type="dxa" w:w="100"/>
               <w:left w:type="dxa" w:w="100"/>
@@ -1107,185 +1057,7 @@
                 <w:sz w:val="19"/>
                 <w:szCs w:val="19"/>
               </w:rPr>
-              <w:t xml:space="preserve">12.154.000 đ</w:t>
-            </w:r>
-          </w:p>
-        </w:tc>
-        <w:tc>
-          <w:tcPr>
-            <w:tcW w:type="dxa" w:w="2200"/>
-            <w:shd w:fill="F1F5F9" w:val="clear"/>
-            <w:tcMar>
-              <w:top w:type="dxa" w:w="100"/>
-              <w:left w:type="dxa" w:w="100"/>
-              <w:bottom w:type="dxa" w:w="100"/>
-              <w:right w:type="dxa" w:w="100"/>
-            </w:tcMar>
-            <w:vAlign w:val="center"/>
-          </w:tcPr>
-          <w:p>
-            <w:pPr>
-              <w:jc w:val="center"/>
-            </w:pPr>
-            <w:r>
-              <w:rPr>
-                <w:b w:val="false"/>
-                <w:bCs w:val="false"/>
-                <w:i w:val="false"/>
-                <w:iCs w:val="false"/>
-                <w:color w:val="1C2035"/>
-                <w:sz w:val="19"/>
-                <w:szCs w:val="19"/>
-              </w:rPr>
-              <w:t xml:space="preserve">—</w:t>
-            </w:r>
-          </w:p>
-        </w:tc>
-        <w:tc>
-          <w:tcPr>
-            <w:tcW w:type="dxa" w:w="3200"/>
-            <w:shd w:fill="F1F5F9" w:val="clear"/>
-            <w:tcMar>
-              <w:top w:type="dxa" w:w="100"/>
-              <w:left w:type="dxa" w:w="100"/>
-              <w:bottom w:type="dxa" w:w="100"/>
-              <w:right w:type="dxa" w:w="100"/>
-            </w:tcMar>
-            <w:vAlign w:val="center"/>
-          </w:tcPr>
-          <w:p>
-            <w:pPr>
-              <w:jc w:val="left"/>
-            </w:pPr>
-            <w:r>
-              <w:rPr>
-                <w:b w:val="false"/>
-                <w:bCs w:val="false"/>
-                <w:i w:val="false"/>
-                <w:iCs w:val="false"/>
-                <w:color w:val="1C2035"/>
-                <w:sz w:val="18"/>
-                <w:szCs w:val="18"/>
-              </w:rPr>
-              <w:t xml:space="preserve">Cân bằng chi phí - thời gian, đủ dài cho cả giai đoạn mở bán dự án</w:t>
-            </w:r>
-          </w:p>
-        </w:tc>
-      </w:tr>
-      <w:tr>
-        <w:tc>
-          <w:tcPr>
-            <w:tcW w:type="dxa" w:w="2600"/>
-            <w:tcMar>
-              <w:top w:type="dxa" w:w="100"/>
-              <w:left w:type="dxa" w:w="100"/>
-              <w:bottom w:type="dxa" w:w="100"/>
-              <w:right w:type="dxa" w:w="100"/>
-            </w:tcMar>
-            <w:vAlign w:val="center"/>
-          </w:tcPr>
-          <w:p>
-            <w:pPr>
-              <w:jc w:val="left"/>
-            </w:pPr>
-            <w:r>
-              <w:rPr>
-                <w:b w:val="false"/>
-                <w:bCs w:val="false"/>
-                <w:i w:val="false"/>
-                <w:iCs w:val="false"/>
-                <w:color w:val="1C2035"/>
-                <w:sz w:val="19"/>
-                <w:szCs w:val="19"/>
-              </w:rPr>
-              <w:t xml:space="preserve">Vĩnh viễn (tồn tại theo domain)</w:t>
-            </w:r>
-          </w:p>
-        </w:tc>
-        <w:tc>
-          <w:tcPr>
-            <w:tcW w:type="dxa" w:w="2200"/>
-            <w:tcMar>
-              <w:top w:type="dxa" w:w="100"/>
-              <w:left w:type="dxa" w:w="100"/>
-              <w:bottom w:type="dxa" w:w="100"/>
-              <w:right w:type="dxa" w:w="100"/>
-            </w:tcMar>
-            <w:vAlign w:val="center"/>
-          </w:tcPr>
-          <w:p>
-            <w:pPr>
-              <w:jc w:val="right"/>
-            </w:pPr>
-            <w:r>
-              <w:rPr>
-                <w:b/>
-                <w:bCs/>
-                <w:i w:val="false"/>
-                <w:iCs w:val="false"/>
-                <w:color w:val="1C2035"/>
-                <w:sz w:val="19"/>
-                <w:szCs w:val="19"/>
-              </w:rPr>
               <w:t xml:space="preserve">15.759.000 đ</w:t>
-            </w:r>
-          </w:p>
-        </w:tc>
-        <w:tc>
-          <w:tcPr>
-            <w:tcW w:type="dxa" w:w="2200"/>
-            <w:tcMar>
-              <w:top w:type="dxa" w:w="100"/>
-              <w:left w:type="dxa" w:w="100"/>
-              <w:bottom w:type="dxa" w:w="100"/>
-              <w:right w:type="dxa" w:w="100"/>
-            </w:tcMar>
-            <w:vAlign w:val="center"/>
-          </w:tcPr>
-          <w:p>
-            <w:pPr>
-              <w:jc w:val="center"/>
-            </w:pPr>
-            <w:r>
-              <w:rPr>
-                <w:b w:val="false"/>
-                <w:bCs w:val="false"/>
-                <w:i w:val="false"/>
-                <w:iCs w:val="false"/>
-                <w:color w:val="1C2035"/>
-                <w:sz w:val="19"/>
-                <w:szCs w:val="19"/>
-              </w:rPr>
-              <w:t xml:space="preserve">+3.605.000 đ</w:t>
-            </w:r>
-          </w:p>
-        </w:tc>
-        <w:tc>
-          <w:tcPr>
-            <w:tcW w:type="dxa" w:w="3200"/>
-            <w:tcMar>
-              <w:top w:type="dxa" w:w="100"/>
-              <w:left w:type="dxa" w:w="100"/>
-              <w:bottom w:type="dxa" w:w="100"/>
-              <w:right w:type="dxa" w:w="100"/>
-            </w:tcMar>
-            <w:vAlign w:val="center"/>
-          </w:tcPr>
-          <w:p>
-            <w:pPr>
-              <w:jc w:val="left"/>
-            </w:pPr>
-            <w:r>
-              <w:rPr>
-                <w:b w:val="false"/>
-                <w:bCs w:val="false"/>
-                <w:i w:val="false"/>
-                <w:iCs w:val="false"/>
-                <w:color w:val="1C2035"/>
-                <w:sz w:val="18"/>
-                <w:szCs w:val="18"/>
-              </w:rPr>
-              <w:t xml:space="preserve">Bài không bị gỡ trừ khi VnExpress ngừng hoạt động - tối ưu cho SEO/backlink lâu dài</w:t>
             </w:r>
           </w:p>
         </w:tc>
@@ -1293,7 +1065,7 @@
     </w:tbl>
     <w:p>
       <w:pPr>
-        <w:spacing w:after="100" w:before="260"/>
+        <w:spacing w:after="100" w:before="300"/>
       </w:pPr>
       <w:r>
         <w:rPr>
@@ -1339,7 +1111,7 @@
           <w:sz w:val="20"/>
           <w:szCs w:val="20"/>
         </w:rPr>
-        <w:t xml:space="preserve">Cần đầy đủ giấy tờ pháp lý công ty/dự án (giấy phép kinh doanh, quyết định phê duyệt dự án hoặc giấy tờ liên quan) để toà soạn duyệt nội dung PR.</w:t>
+        <w:t xml:space="preserve">VietNamNet và CafeF ở vị trí tiểu mục/tin doanh nghiệp phổ biến (không thuê riêng chuyên mục Bất động sản) — bài vẫn viết đầy đủ nội dung dự án như bình thường, chỉ khác phân loại chuyên mục hiển thị. Nếu cần đúng chuyên mục Bất động sản, báo lại để nâng giá.</w:t>
       </w:r>
     </w:p>
     <w:p>
@@ -1357,7 +1129,7 @@
           <w:sz w:val="20"/>
           <w:szCs w:val="20"/>
         </w:rPr>
-        <w:t xml:space="preserve">Nội dung bài viết do Digicom hỗ trợ biên tập theo đúng văn phong báo chí, tuân thủ yêu cầu biên tập của từng báo (độ dài, số ảnh, số link nêu ở cột Quy cách).</w:t>
+        <w:t xml:space="preserve">Cần đầy đủ giấy tờ pháp lý công ty/dự án (giấy phép kinh doanh, quyết định phê duyệt dự án hoặc giấy tờ liên quan) để toà soạn duyệt nội dung PR.</w:t>
       </w:r>
     </w:p>
     <w:p>
@@ -1375,7 +1147,7 @@
           <w:sz w:val="20"/>
           <w:szCs w:val="20"/>
         </w:rPr>
-        <w:t xml:space="preserve">Thời gian duyệt bài: 1-3 ngày làm việc tuỳ báo, kể từ khi nhận đủ nội dung và giấy tờ.</w:t>
+        <w:t xml:space="preserve">Nội dung bài viết do Digicom hỗ trợ biên tập theo đúng văn phong báo chí, tuân thủ yêu cầu biên tập của từng báo (độ dài, số ảnh, số link nêu ở cột Quy cách).</w:t>
       </w:r>
     </w:p>
     <w:p>
@@ -1393,7 +1165,7 @@
           <w:sz w:val="20"/>
           <w:szCs w:val="20"/>
         </w:rPr>
-        <w:t xml:space="preserve">Có thể nâng vị trí đăng (trang chủ, box nổi bật...) theo yêu cầu — báo giá riêng cho từng vị trí nâng cấp.</w:t>
+        <w:t xml:space="preserve">Thời gian duyệt bài: 1-3 ngày làm việc tuỳ báo, kể từ khi nhận đủ nội dung và giấy tờ.</w:t>
       </w:r>
     </w:p>
     <w:p>

</xml_diff>

<commit_message>
auto: session 2026-08-04 11:14
Co-Authored-By: Claude Opus 4.8 (1M context) <noreply@anthropic.com>
</commit_message>
<xml_diff>
--- a/11-bao-gia-khach/Bao-gia-Booking-PR-BDS-4-bao-2026-08-04.docx
+++ b/11-bao-gia-khach/Bao-gia-Booking-PR-BDS-4-bao-2026-08-04.docx
@@ -350,7 +350,7 @@
                 <w:sz w:val="19"/>
                 <w:szCs w:val="19"/>
               </w:rPr>
-              <w:t xml:space="preserve">8.034.000 đ</w:t>
+              <w:t xml:space="preserve">6.798.000 đ</w:t>
             </w:r>
           </w:p>
         </w:tc>
@@ -771,7 +771,7 @@
                 <w:sz w:val="22"/>
                 <w:szCs w:val="22"/>
               </w:rPr>
-              <w:t xml:space="preserve">30.467.000 đ</w:t>
+              <w:t xml:space="preserve">29.231.000 đ</w:t>
             </w:r>
           </w:p>
         </w:tc>
@@ -935,7 +935,7 @@
                 <w:sz w:val="19"/>
                 <w:szCs w:val="19"/>
               </w:rPr>
-              <w:t xml:space="preserve">8.034.000 đ</w:t>
+              <w:t xml:space="preserve">6.798.000 đ</w:t>
             </w:r>
           </w:p>
         </w:tc>
@@ -997,7 +997,7 @@
                 <w:sz w:val="19"/>
                 <w:szCs w:val="19"/>
               </w:rPr>
-              <w:t xml:space="preserve">12.154.000 đ</w:t>
+              <w:t xml:space="preserve">10.197.000 đ</w:t>
             </w:r>
           </w:p>
         </w:tc>
@@ -1057,7 +1057,7 @@
                 <w:sz w:val="19"/>
                 <w:szCs w:val="19"/>
               </w:rPr>
-              <w:t xml:space="preserve">15.759.000 đ</w:t>
+              <w:t xml:space="preserve">13.596.000 đ</w:t>
             </w:r>
           </w:p>
         </w:tc>

</xml_diff>

<commit_message>
auto: session 2026-08-04 11:21
Co-Authored-By: Claude Opus 4.8 (1M context) <noreply@anthropic.com>
</commit_message>
<xml_diff>
--- a/11-bao-gia-khach/Bao-gia-Booking-PR-BDS-4-bao-2026-08-04.docx
+++ b/11-bao-gia-khach/Bao-gia-Booking-PR-BDS-4-bao-2026-08-04.docx
@@ -60,7 +60,7 @@
           <w:sz w:val="22"/>
           <w:szCs w:val="22"/>
         </w:rPr>
-        <w:t xml:space="preserve">Dự án: Bất động sản  ·  Gói tối ưu chi phí</w:t>
+        <w:t xml:space="preserve">Dự án: Bất động sản</w:t>
       </w:r>
     </w:p>
     <w:p>
@@ -111,7 +111,7 @@
           <w:sz w:val="20"/>
           <w:szCs w:val="20"/>
         </w:rPr>
-        <w:t xml:space="preserve">Viết và đăng bài PR cho dự án bất động sản trên 4 đầu báo điện tử: VnExpress, VietNamNet, Dân Trí, CafeF. Vị trí bên dưới đã chọn mức chi phí tối ưu — chuyên mục/tiểu mục phổ biến, phù hợp giới thiệu dự án và mở bán, không cần vị trí nổi bật trang chủ.</w:t>
+        <w:t xml:space="preserve">Viết và đăng bài PR cho dự án bất động sản trên 4 đầu báo điện tử: VnExpress, VietNamNet, Dân Trí, CafeF. Vị trí đề xuất thuộc chuyên mục Kinh doanh / Bất động sản, phù hợp giới thiệu dự án và mở bán.</w:t>
       </w:r>
     </w:p>
     <w:tbl>
@@ -350,7 +350,7 @@
                 <w:sz w:val="19"/>
                 <w:szCs w:val="19"/>
               </w:rPr>
-              <w:t xml:space="preserve">6.798.000 đ</w:t>
+              <w:t xml:space="preserve">8.034.000 đ</w:t>
             </w:r>
           </w:p>
         </w:tc>
@@ -442,7 +442,7 @@
                 <w:sz w:val="19"/>
                 <w:szCs w:val="19"/>
               </w:rPr>
-              <w:t xml:space="preserve">Bài 1.000 chữ, 5 ảnh chất lượng cao, không chèn link</w:t>
+              <w:t xml:space="preserve">Bài dưới 1.000 từ, dưới 3 ảnh · link no (nếu cần) tính thêm 5tr/3 tháng</w:t>
             </w:r>
           </w:p>
         </w:tc>
@@ -472,7 +472,7 @@
                 <w:sz w:val="19"/>
                 <w:szCs w:val="19"/>
               </w:rPr>
-              <w:t xml:space="preserve">5.026.000 đ</w:t>
+              <w:t xml:space="preserve">5.150.000 đ</w:t>
             </w:r>
           </w:p>
         </w:tc>
@@ -652,7 +652,7 @@
                 <w:sz w:val="19"/>
                 <w:szCs w:val="19"/>
               </w:rPr>
-              <w:t xml:space="preserve">Tin doanh nghiệp</w:t>
+              <w:t xml:space="preserve">Chuyên mục 1 (Bất động sản, Doanh nghiệp, Tài chính - Ngân hàng, Chứng khoán, Smart Money)</w:t>
             </w:r>
           </w:p>
         </w:tc>
@@ -682,7 +682,7 @@
                 <w:sz w:val="19"/>
                 <w:szCs w:val="19"/>
               </w:rPr>
-              <w:t xml:space="preserve">Bài 1.000 chữ, 5 ảnh, 1 link no (mua thêm link 500k/link)</w:t>
+              <w:t xml:space="preserve">Bài dưới 1.000 từ, dưới 5 ảnh</w:t>
             </w:r>
           </w:p>
         </w:tc>
@@ -712,7 +712,7 @@
                 <w:sz w:val="19"/>
                 <w:szCs w:val="19"/>
               </w:rPr>
-              <w:t xml:space="preserve">6.592.000 đ</w:t>
+              <w:t xml:space="preserve">10.712.000 đ</w:t>
             </w:r>
           </w:p>
         </w:tc>
@@ -771,7 +771,7 @@
                 <w:sz w:val="22"/>
                 <w:szCs w:val="22"/>
               </w:rPr>
-              <w:t xml:space="preserve">29.231.000 đ</w:t>
+              <w:t xml:space="preserve">34.711.000 đ</w:t>
             </w:r>
           </w:p>
         </w:tc>
@@ -789,7 +789,7 @@
           <w:sz w:val="23"/>
           <w:szCs w:val="23"/>
         </w:rPr>
-        <w:t xml:space="preserve">Thời hạn bài đăng VnExpress - có thể chọn thêm</w:t>
+        <w:t xml:space="preserve">Lựa chọn thời hạn bài đăng - VnExpress</w:t>
       </w:r>
     </w:p>
     <w:p>
@@ -935,7 +935,7 @@
                 <w:sz w:val="19"/>
                 <w:szCs w:val="19"/>
               </w:rPr>
-              <w:t xml:space="preserve">6.798.000 đ</w:t>
+              <w:t xml:space="preserve">8.034.000 đ</w:t>
             </w:r>
           </w:p>
         </w:tc>
@@ -997,7 +997,7 @@
                 <w:sz w:val="19"/>
                 <w:szCs w:val="19"/>
               </w:rPr>
-              <w:t xml:space="preserve">10.197.000 đ</w:t>
+              <w:t xml:space="preserve">12.154.000 đ</w:t>
             </w:r>
           </w:p>
         </w:tc>
@@ -1057,7 +1057,7 @@
                 <w:sz w:val="19"/>
                 <w:szCs w:val="19"/>
               </w:rPr>
-              <w:t xml:space="preserve">13.596.000 đ</w:t>
+              <w:t xml:space="preserve">15.759.000 đ</w:t>
             </w:r>
           </w:p>
         </w:tc>
@@ -1111,7 +1111,7 @@
           <w:sz w:val="20"/>
           <w:szCs w:val="20"/>
         </w:rPr>
-        <w:t xml:space="preserve">VietNamNet và CafeF ở vị trí tiểu mục/tin doanh nghiệp phổ biến (không thuê riêng chuyên mục Bất động sản) — bài vẫn viết đầy đủ nội dung dự án như bình thường, chỉ khác phân loại chuyên mục hiển thị. Nếu cần đúng chuyên mục Bất động sản, báo lại để nâng giá.</w:t>
+        <w:t xml:space="preserve">Cần đầy đủ giấy tờ pháp lý công ty/dự án (giấy phép kinh doanh, quyết định phê duyệt dự án hoặc giấy tờ liên quan) để toà soạn duyệt nội dung PR.</w:t>
       </w:r>
     </w:p>
     <w:p>
@@ -1129,7 +1129,7 @@
           <w:sz w:val="20"/>
           <w:szCs w:val="20"/>
         </w:rPr>
-        <w:t xml:space="preserve">Cần đầy đủ giấy tờ pháp lý công ty/dự án (giấy phép kinh doanh, quyết định phê duyệt dự án hoặc giấy tờ liên quan) để toà soạn duyệt nội dung PR.</w:t>
+        <w:t xml:space="preserve">Nội dung bài viết do Digicom hỗ trợ biên tập theo đúng văn phong báo chí, tuân thủ yêu cầu biên tập của từng báo (độ dài, số ảnh, số link nêu ở cột Quy cách).</w:t>
       </w:r>
     </w:p>
     <w:p>
@@ -1147,7 +1147,7 @@
           <w:sz w:val="20"/>
           <w:szCs w:val="20"/>
         </w:rPr>
-        <w:t xml:space="preserve">Nội dung bài viết do Digicom hỗ trợ biên tập theo đúng văn phong báo chí, tuân thủ yêu cầu biên tập của từng báo (độ dài, số ảnh, số link nêu ở cột Quy cách).</w:t>
+        <w:t xml:space="preserve">Thời gian duyệt bài: 1-3 ngày làm việc tuỳ báo, kể từ khi nhận đủ nội dung và giấy tờ.</w:t>
       </w:r>
     </w:p>
     <w:p>
@@ -1165,7 +1165,7 @@
           <w:sz w:val="20"/>
           <w:szCs w:val="20"/>
         </w:rPr>
-        <w:t xml:space="preserve">Thời gian duyệt bài: 1-3 ngày làm việc tuỳ báo, kể từ khi nhận đủ nội dung và giấy tờ.</w:t>
+        <w:t xml:space="preserve">Có thể nâng vị trí đăng (trang chủ, box nổi bật...) theo yêu cầu — báo giá riêng cho từng vị trí nâng cấp.</w:t>
       </w:r>
     </w:p>
     <w:p>

</xml_diff>

<commit_message>
auto: session 2026-08-04 11:24
Co-Authored-By: Claude Opus 4.8 (1M context) <noreply@anthropic.com>
</commit_message>
<xml_diff>
--- a/11-bao-gia-khach/Bao-gia-Booking-PR-BDS-4-bao-2026-08-04.docx
+++ b/11-bao-gia-khach/Bao-gia-Booking-PR-BDS-4-bao-2026-08-04.docx
@@ -60,7 +60,7 @@
           <w:sz w:val="22"/>
           <w:szCs w:val="22"/>
         </w:rPr>
-        <w:t xml:space="preserve">Dự án: Bất động sản</w:t>
+        <w:t xml:space="preserve">Dự án: Bất động sản  ·  Ưu đãi đặc biệt -5%</w:t>
       </w:r>
     </w:p>
     <w:p>
@@ -128,9 +128,10 @@
       </w:tblPr>
       <w:tblGrid>
         <w:gridCol w:w="1600"/>
-        <w:gridCol w:w="2600"/>
-        <w:gridCol w:w="3800"/>
         <w:gridCol w:w="2200"/>
+        <w:gridCol w:w="3300"/>
+        <w:gridCol w:w="1650"/>
+        <w:gridCol w:w="1450"/>
       </w:tblGrid>
       <w:tr>
         <w:trPr>
@@ -163,7 +164,7 @@
         </w:tc>
         <w:tc>
           <w:tcPr>
-            <w:tcW w:type="dxa" w:w="2600"/>
+            <w:tcW w:type="dxa" w:w="2200"/>
             <w:shd w:fill="1C2035" w:val="clear"/>
             <w:tcMar>
               <w:top w:type="dxa" w:w="100"/>
@@ -188,7 +189,7 @@
         </w:tc>
         <w:tc>
           <w:tcPr>
-            <w:tcW w:type="dxa" w:w="3800"/>
+            <w:tcW w:type="dxa" w:w="3300"/>
             <w:shd w:fill="1C2035" w:val="clear"/>
             <w:tcMar>
               <w:top w:type="dxa" w:w="100"/>
@@ -213,7 +214,7 @@
         </w:tc>
         <w:tc>
           <w:tcPr>
-            <w:tcW w:type="dxa" w:w="2200"/>
+            <w:tcW w:type="dxa" w:w="1650"/>
             <w:shd w:fill="1C2035" w:val="clear"/>
             <w:tcMar>
               <w:top w:type="dxa" w:w="100"/>
@@ -232,7 +233,32 @@
                 <w:sz w:val="20"/>
                 <w:szCs w:val="20"/>
               </w:rPr>
-              <w:t xml:space="preserve">Đơn giá (chưa VAT)</w:t>
+              <w:t xml:space="preserve">Giá gốc</w:t>
+            </w:r>
+          </w:p>
+        </w:tc>
+        <w:tc>
+          <w:tcPr>
+            <w:tcW w:type="dxa" w:w="1450"/>
+            <w:shd w:fill="1C2035" w:val="clear"/>
+            <w:tcMar>
+              <w:top w:type="dxa" w:w="100"/>
+              <w:left w:type="dxa" w:w="100"/>
+              <w:bottom w:type="dxa" w:w="100"/>
+              <w:right w:type="dxa" w:w="100"/>
+            </w:tcMar>
+            <w:vAlign w:val="center"/>
+          </w:tcPr>
+          <w:p>
+            <w:r>
+              <w:rPr>
+                <w:b/>
+                <w:bCs/>
+                <w:color w:val="FFFFFF"/>
+                <w:sz w:val="20"/>
+                <w:szCs w:val="20"/>
+              </w:rPr>
+              <w:t xml:space="preserve">Ưu đãi -5%</w:t>
             </w:r>
           </w:p>
         </w:tc>
@@ -259,6 +285,7 @@
                 <w:bCs/>
                 <w:i w:val="false"/>
                 <w:iCs w:val="false"/>
+                <w:strike w:val="false"/>
                 <w:color w:val="1C2035"/>
                 <w:sz w:val="19"/>
                 <w:szCs w:val="19"/>
@@ -269,7 +296,7 @@
         </w:tc>
         <w:tc>
           <w:tcPr>
-            <w:tcW w:type="dxa" w:w="2600"/>
+            <w:tcW w:type="dxa" w:w="2200"/>
             <w:tcMar>
               <w:top w:type="dxa" w:w="100"/>
               <w:left w:type="dxa" w:w="100"/>
@@ -288,6 +315,7 @@
                 <w:bCs w:val="false"/>
                 <w:i w:val="false"/>
                 <w:iCs w:val="false"/>
+                <w:strike w:val="false"/>
                 <w:color w:val="1C2035"/>
                 <w:sz w:val="19"/>
                 <w:szCs w:val="19"/>
@@ -298,7 +326,7 @@
         </w:tc>
         <w:tc>
           <w:tcPr>
-            <w:tcW w:type="dxa" w:w="3800"/>
+            <w:tcW w:type="dxa" w:w="3300"/>
             <w:tcMar>
               <w:top w:type="dxa" w:w="100"/>
               <w:left w:type="dxa" w:w="100"/>
@@ -317,40 +345,229 @@
                 <w:bCs w:val="false"/>
                 <w:i w:val="false"/>
                 <w:iCs w:val="false"/>
-                <w:color w:val="1C2035"/>
+                <w:strike w:val="false"/>
+                <w:color w:val="1C2035"/>
+                <w:sz w:val="18"/>
+                <w:szCs w:val="18"/>
+              </w:rPr>
+              <w:t xml:space="preserve">Bài dưới 1.000 từ, dưới 3 ảnh, 2 link no · bài lưu trên site 6 tháng kể từ ngày đăng</w:t>
+            </w:r>
+          </w:p>
+        </w:tc>
+        <w:tc>
+          <w:tcPr>
+            <w:tcW w:type="dxa" w:w="1650"/>
+            <w:tcMar>
+              <w:top w:type="dxa" w:w="100"/>
+              <w:left w:type="dxa" w:w="100"/>
+              <w:bottom w:type="dxa" w:w="100"/>
+              <w:right w:type="dxa" w:w="100"/>
+            </w:tcMar>
+            <w:vAlign w:val="center"/>
+          </w:tcPr>
+          <w:p>
+            <w:pPr>
+              <w:jc w:val="right"/>
+            </w:pPr>
+            <w:r>
+              <w:rPr>
+                <w:b w:val="false"/>
+                <w:bCs w:val="false"/>
+                <w:i w:val="false"/>
+                <w:iCs w:val="false"/>
+                <w:strike/>
+                <w:color w:val="8A94A3"/>
+                <w:sz w:val="18"/>
+                <w:szCs w:val="18"/>
+              </w:rPr>
+              <w:t xml:space="preserve">7.800.000 đ</w:t>
+            </w:r>
+          </w:p>
+        </w:tc>
+        <w:tc>
+          <w:tcPr>
+            <w:tcW w:type="dxa" w:w="1450"/>
+            <w:tcMar>
+              <w:top w:type="dxa" w:w="100"/>
+              <w:left w:type="dxa" w:w="100"/>
+              <w:bottom w:type="dxa" w:w="100"/>
+              <w:right w:type="dxa" w:w="100"/>
+            </w:tcMar>
+            <w:vAlign w:val="center"/>
+          </w:tcPr>
+          <w:p>
+            <w:pPr>
+              <w:jc w:val="right"/>
+            </w:pPr>
+            <w:r>
+              <w:rPr>
+                <w:b/>
+                <w:bCs/>
+                <w:i w:val="false"/>
+                <w:iCs w:val="false"/>
+                <w:strike w:val="false"/>
+                <w:color w:val="D14343"/>
                 <w:sz w:val="19"/>
                 <w:szCs w:val="19"/>
               </w:rPr>
-              <w:t xml:space="preserve">Bài dưới 1.000 từ, dưới 3 ảnh, 2 link no · bài lưu trên site 6 tháng kể từ ngày đăng</w:t>
-            </w:r>
-          </w:p>
-        </w:tc>
-        <w:tc>
-          <w:tcPr>
-            <w:tcW w:type="dxa" w:w="2200"/>
-            <w:tcMar>
-              <w:top w:type="dxa" w:w="100"/>
-              <w:left w:type="dxa" w:w="100"/>
-              <w:bottom w:type="dxa" w:w="100"/>
-              <w:right w:type="dxa" w:w="100"/>
-            </w:tcMar>
-            <w:vAlign w:val="center"/>
-          </w:tcPr>
-          <w:p>
-            <w:pPr>
-              <w:jc w:val="right"/>
-            </w:pPr>
-            <w:r>
-              <w:rPr>
-                <w:b/>
-                <w:bCs/>
-                <w:i w:val="false"/>
-                <w:iCs w:val="false"/>
+              <w:t xml:space="preserve">7.410.000 đ</w:t>
+            </w:r>
+          </w:p>
+        </w:tc>
+      </w:tr>
+      <w:tr>
+        <w:tc>
+          <w:tcPr>
+            <w:tcW w:type="dxa" w:w="1600"/>
+            <w:shd w:fill="F1F5F9" w:val="clear"/>
+            <w:tcMar>
+              <w:top w:type="dxa" w:w="100"/>
+              <w:left w:type="dxa" w:w="100"/>
+              <w:bottom w:type="dxa" w:w="100"/>
+              <w:right w:type="dxa" w:w="100"/>
+            </w:tcMar>
+            <w:vAlign w:val="center"/>
+          </w:tcPr>
+          <w:p>
+            <w:pPr>
+              <w:jc w:val="left"/>
+            </w:pPr>
+            <w:r>
+              <w:rPr>
+                <w:b/>
+                <w:bCs/>
+                <w:i w:val="false"/>
+                <w:iCs w:val="false"/>
+                <w:strike w:val="false"/>
                 <w:color w:val="1C2035"/>
                 <w:sz w:val="19"/>
                 <w:szCs w:val="19"/>
               </w:rPr>
-              <w:t xml:space="preserve">8.034.000 đ</w:t>
+              <w:t xml:space="preserve">VietNamNet.vn</w:t>
+            </w:r>
+          </w:p>
+        </w:tc>
+        <w:tc>
+          <w:tcPr>
+            <w:tcW w:type="dxa" w:w="2200"/>
+            <w:shd w:fill="F1F5F9" w:val="clear"/>
+            <w:tcMar>
+              <w:top w:type="dxa" w:w="100"/>
+              <w:left w:type="dxa" w:w="100"/>
+              <w:bottom w:type="dxa" w:w="100"/>
+              <w:right w:type="dxa" w:w="100"/>
+            </w:tcMar>
+            <w:vAlign w:val="center"/>
+          </w:tcPr>
+          <w:p>
+            <w:pPr>
+              <w:jc w:val="left"/>
+            </w:pPr>
+            <w:r>
+              <w:rPr>
+                <w:b w:val="false"/>
+                <w:bCs w:val="false"/>
+                <w:i w:val="false"/>
+                <w:iCs w:val="false"/>
+                <w:strike w:val="false"/>
+                <w:color w:val="1C2035"/>
+                <w:sz w:val="19"/>
+                <w:szCs w:val="19"/>
+              </w:rPr>
+              <w:t xml:space="preserve">Tiểu mục</w:t>
+            </w:r>
+          </w:p>
+        </w:tc>
+        <w:tc>
+          <w:tcPr>
+            <w:tcW w:type="dxa" w:w="3300"/>
+            <w:shd w:fill="F1F5F9" w:val="clear"/>
+            <w:tcMar>
+              <w:top w:type="dxa" w:w="100"/>
+              <w:left w:type="dxa" w:w="100"/>
+              <w:bottom w:type="dxa" w:w="100"/>
+              <w:right w:type="dxa" w:w="100"/>
+            </w:tcMar>
+            <w:vAlign w:val="center"/>
+          </w:tcPr>
+          <w:p>
+            <w:pPr>
+              <w:jc w:val="left"/>
+            </w:pPr>
+            <w:r>
+              <w:rPr>
+                <w:b w:val="false"/>
+                <w:bCs w:val="false"/>
+                <w:i w:val="false"/>
+                <w:iCs w:val="false"/>
+                <w:strike w:val="false"/>
+                <w:color w:val="1C2035"/>
+                <w:sz w:val="18"/>
+                <w:szCs w:val="18"/>
+              </w:rPr>
+              <w:t xml:space="preserve">Bài dưới 1.000 từ, dưới 3 ảnh · link no (nếu cần) tính thêm 5tr/3 tháng</w:t>
+            </w:r>
+          </w:p>
+        </w:tc>
+        <w:tc>
+          <w:tcPr>
+            <w:tcW w:type="dxa" w:w="1650"/>
+            <w:shd w:fill="F1F5F9" w:val="clear"/>
+            <w:tcMar>
+              <w:top w:type="dxa" w:w="100"/>
+              <w:left w:type="dxa" w:w="100"/>
+              <w:bottom w:type="dxa" w:w="100"/>
+              <w:right w:type="dxa" w:w="100"/>
+            </w:tcMar>
+            <w:vAlign w:val="center"/>
+          </w:tcPr>
+          <w:p>
+            <w:pPr>
+              <w:jc w:val="right"/>
+            </w:pPr>
+            <w:r>
+              <w:rPr>
+                <w:b w:val="false"/>
+                <w:bCs w:val="false"/>
+                <w:i w:val="false"/>
+                <w:iCs w:val="false"/>
+                <w:strike/>
+                <w:color w:val="8A94A3"/>
+                <w:sz w:val="18"/>
+                <w:szCs w:val="18"/>
+              </w:rPr>
+              <w:t xml:space="preserve">5.000.000 đ</w:t>
+            </w:r>
+          </w:p>
+        </w:tc>
+        <w:tc>
+          <w:tcPr>
+            <w:tcW w:type="dxa" w:w="1450"/>
+            <w:shd w:fill="F1F5F9" w:val="clear"/>
+            <w:tcMar>
+              <w:top w:type="dxa" w:w="100"/>
+              <w:left w:type="dxa" w:w="100"/>
+              <w:bottom w:type="dxa" w:w="100"/>
+              <w:right w:type="dxa" w:w="100"/>
+            </w:tcMar>
+            <w:vAlign w:val="center"/>
+          </w:tcPr>
+          <w:p>
+            <w:pPr>
+              <w:jc w:val="right"/>
+            </w:pPr>
+            <w:r>
+              <w:rPr>
+                <w:b/>
+                <w:bCs/>
+                <w:i w:val="false"/>
+                <w:iCs w:val="false"/>
+                <w:strike w:val="false"/>
+                <w:color w:val="D14343"/>
+                <w:sz w:val="19"/>
+                <w:szCs w:val="19"/>
+              </w:rPr>
+              <w:t xml:space="preserve">4.750.000 đ</w:t>
             </w:r>
           </w:p>
         </w:tc>
@@ -359,7 +576,6 @@
         <w:tc>
           <w:tcPr>
             <w:tcW w:type="dxa" w:w="1600"/>
-            <w:shd w:fill="F1F5F9" w:val="clear"/>
             <w:tcMar>
               <w:top w:type="dxa" w:w="100"/>
               <w:left w:type="dxa" w:w="100"/>
@@ -378,18 +594,18 @@
                 <w:bCs/>
                 <w:i w:val="false"/>
                 <w:iCs w:val="false"/>
+                <w:strike w:val="false"/>
                 <w:color w:val="1C2035"/>
                 <w:sz w:val="19"/>
                 <w:szCs w:val="19"/>
               </w:rPr>
-              <w:t xml:space="preserve">VietNamNet.vn</w:t>
-            </w:r>
-          </w:p>
-        </w:tc>
-        <w:tc>
-          <w:tcPr>
-            <w:tcW w:type="dxa" w:w="2600"/>
-            <w:shd w:fill="F1F5F9" w:val="clear"/>
+              <w:t xml:space="preserve">Dân Trí (dantri.com.vn)</w:t>
+            </w:r>
+          </w:p>
+        </w:tc>
+        <w:tc>
+          <w:tcPr>
+            <w:tcW w:type="dxa" w:w="2200"/>
             <w:tcMar>
               <w:top w:type="dxa" w:w="100"/>
               <w:left w:type="dxa" w:w="100"/>
@@ -408,18 +624,18 @@
                 <w:bCs w:val="false"/>
                 <w:i w:val="false"/>
                 <w:iCs w:val="false"/>
+                <w:strike w:val="false"/>
                 <w:color w:val="1C2035"/>
                 <w:sz w:val="19"/>
                 <w:szCs w:val="19"/>
               </w:rPr>
-              <w:t xml:space="preserve">Tiểu mục</w:t>
-            </w:r>
-          </w:p>
-        </w:tc>
-        <w:tc>
-          <w:tcPr>
-            <w:tcW w:type="dxa" w:w="3800"/>
-            <w:shd w:fill="F1F5F9" w:val="clear"/>
+              <w:t xml:space="preserve">Tiểu mục nhóm 1 (Kinh doanh / Bất động sản)</w:t>
+            </w:r>
+          </w:p>
+        </w:tc>
+        <w:tc>
+          <w:tcPr>
+            <w:tcW w:type="dxa" w:w="3300"/>
             <w:tcMar>
               <w:top w:type="dxa" w:w="100"/>
               <w:left w:type="dxa" w:w="100"/>
@@ -438,11 +654,105 @@
                 <w:bCs w:val="false"/>
                 <w:i w:val="false"/>
                 <w:iCs w:val="false"/>
-                <w:color w:val="1C2035"/>
+                <w:strike w:val="false"/>
+                <w:color w:val="1C2035"/>
+                <w:sz w:val="18"/>
+                <w:szCs w:val="18"/>
+              </w:rPr>
+              <w:t xml:space="preserve">Bài dưới 1.000 từ, dưới 3 ảnh, mua thêm link 500k/link (gói 3 link 1 triệu)</w:t>
+            </w:r>
+          </w:p>
+        </w:tc>
+        <w:tc>
+          <w:tcPr>
+            <w:tcW w:type="dxa" w:w="1650"/>
+            <w:tcMar>
+              <w:top w:type="dxa" w:w="100"/>
+              <w:left w:type="dxa" w:w="100"/>
+              <w:bottom w:type="dxa" w:w="100"/>
+              <w:right w:type="dxa" w:w="100"/>
+            </w:tcMar>
+            <w:vAlign w:val="center"/>
+          </w:tcPr>
+          <w:p>
+            <w:pPr>
+              <w:jc w:val="right"/>
+            </w:pPr>
+            <w:r>
+              <w:rPr>
+                <w:b w:val="false"/>
+                <w:bCs w:val="false"/>
+                <w:i w:val="false"/>
+                <w:iCs w:val="false"/>
+                <w:strike/>
+                <w:color w:val="8A94A3"/>
+                <w:sz w:val="18"/>
+                <w:szCs w:val="18"/>
+              </w:rPr>
+              <w:t xml:space="preserve">10.500.000 đ</w:t>
+            </w:r>
+          </w:p>
+        </w:tc>
+        <w:tc>
+          <w:tcPr>
+            <w:tcW w:type="dxa" w:w="1450"/>
+            <w:tcMar>
+              <w:top w:type="dxa" w:w="100"/>
+              <w:left w:type="dxa" w:w="100"/>
+              <w:bottom w:type="dxa" w:w="100"/>
+              <w:right w:type="dxa" w:w="100"/>
+            </w:tcMar>
+            <w:vAlign w:val="center"/>
+          </w:tcPr>
+          <w:p>
+            <w:pPr>
+              <w:jc w:val="right"/>
+            </w:pPr>
+            <w:r>
+              <w:rPr>
+                <w:b/>
+                <w:bCs/>
+                <w:i w:val="false"/>
+                <w:iCs w:val="false"/>
+                <w:strike w:val="false"/>
+                <w:color w:val="D14343"/>
                 <w:sz w:val="19"/>
                 <w:szCs w:val="19"/>
               </w:rPr>
-              <w:t xml:space="preserve">Bài dưới 1.000 từ, dưới 3 ảnh · link no (nếu cần) tính thêm 5tr/3 tháng</w:t>
+              <w:t xml:space="preserve">9.975.000 đ</w:t>
+            </w:r>
+          </w:p>
+        </w:tc>
+      </w:tr>
+      <w:tr>
+        <w:tc>
+          <w:tcPr>
+            <w:tcW w:type="dxa" w:w="1600"/>
+            <w:shd w:fill="F1F5F9" w:val="clear"/>
+            <w:tcMar>
+              <w:top w:type="dxa" w:w="100"/>
+              <w:left w:type="dxa" w:w="100"/>
+              <w:bottom w:type="dxa" w:w="100"/>
+              <w:right w:type="dxa" w:w="100"/>
+            </w:tcMar>
+            <w:vAlign w:val="center"/>
+          </w:tcPr>
+          <w:p>
+            <w:pPr>
+              <w:jc w:val="left"/>
+            </w:pPr>
+            <w:r>
+              <w:rPr>
+                <w:b/>
+                <w:bCs/>
+                <w:i w:val="false"/>
+                <w:iCs w:val="false"/>
+                <w:strike w:val="false"/>
+                <w:color w:val="1C2035"/>
+                <w:sz w:val="19"/>
+                <w:szCs w:val="19"/>
+              </w:rPr>
+              <w:t xml:space="preserve">CafeF.vn</w:t>
             </w:r>
           </w:p>
         </w:tc>
@@ -460,19 +770,113 @@
           </w:tcPr>
           <w:p>
             <w:pPr>
-              <w:jc w:val="right"/>
-            </w:pPr>
-            <w:r>
-              <w:rPr>
-                <w:b/>
-                <w:bCs/>
-                <w:i w:val="false"/>
-                <w:iCs w:val="false"/>
+              <w:jc w:val="left"/>
+            </w:pPr>
+            <w:r>
+              <w:rPr>
+                <w:b w:val="false"/>
+                <w:bCs w:val="false"/>
+                <w:i w:val="false"/>
+                <w:iCs w:val="false"/>
+                <w:strike w:val="false"/>
                 <w:color w:val="1C2035"/>
                 <w:sz w:val="19"/>
                 <w:szCs w:val="19"/>
               </w:rPr>
-              <w:t xml:space="preserve">5.150.000 đ</w:t>
+              <w:t xml:space="preserve">Chuyên mục 1 (Bất động sản, Doanh nghiệp, Tài chính - Ngân hàng, Chứng khoán, Smart Money)</w:t>
+            </w:r>
+          </w:p>
+        </w:tc>
+        <w:tc>
+          <w:tcPr>
+            <w:tcW w:type="dxa" w:w="3300"/>
+            <w:shd w:fill="F1F5F9" w:val="clear"/>
+            <w:tcMar>
+              <w:top w:type="dxa" w:w="100"/>
+              <w:left w:type="dxa" w:w="100"/>
+              <w:bottom w:type="dxa" w:w="100"/>
+              <w:right w:type="dxa" w:w="100"/>
+            </w:tcMar>
+            <w:vAlign w:val="center"/>
+          </w:tcPr>
+          <w:p>
+            <w:pPr>
+              <w:jc w:val="left"/>
+            </w:pPr>
+            <w:r>
+              <w:rPr>
+                <w:b w:val="false"/>
+                <w:bCs w:val="false"/>
+                <w:i w:val="false"/>
+                <w:iCs w:val="false"/>
+                <w:strike w:val="false"/>
+                <w:color w:val="1C2035"/>
+                <w:sz w:val="18"/>
+                <w:szCs w:val="18"/>
+              </w:rPr>
+              <w:t xml:space="preserve">Bài dưới 1.000 từ, dưới 5 ảnh</w:t>
+            </w:r>
+          </w:p>
+        </w:tc>
+        <w:tc>
+          <w:tcPr>
+            <w:tcW w:type="dxa" w:w="1650"/>
+            <w:shd w:fill="F1F5F9" w:val="clear"/>
+            <w:tcMar>
+              <w:top w:type="dxa" w:w="100"/>
+              <w:left w:type="dxa" w:w="100"/>
+              <w:bottom w:type="dxa" w:w="100"/>
+              <w:right w:type="dxa" w:w="100"/>
+            </w:tcMar>
+            <w:vAlign w:val="center"/>
+          </w:tcPr>
+          <w:p>
+            <w:pPr>
+              <w:jc w:val="right"/>
+            </w:pPr>
+            <w:r>
+              <w:rPr>
+                <w:b w:val="false"/>
+                <w:bCs w:val="false"/>
+                <w:i w:val="false"/>
+                <w:iCs w:val="false"/>
+                <w:strike/>
+                <w:color w:val="8A94A3"/>
+                <w:sz w:val="18"/>
+                <w:szCs w:val="18"/>
+              </w:rPr>
+              <w:t xml:space="preserve">10.400.000 đ</w:t>
+            </w:r>
+          </w:p>
+        </w:tc>
+        <w:tc>
+          <w:tcPr>
+            <w:tcW w:type="dxa" w:w="1450"/>
+            <w:shd w:fill="F1F5F9" w:val="clear"/>
+            <w:tcMar>
+              <w:top w:type="dxa" w:w="100"/>
+              <w:left w:type="dxa" w:w="100"/>
+              <w:bottom w:type="dxa" w:w="100"/>
+              <w:right w:type="dxa" w:w="100"/>
+            </w:tcMar>
+            <w:vAlign w:val="center"/>
+          </w:tcPr>
+          <w:p>
+            <w:pPr>
+              <w:jc w:val="right"/>
+            </w:pPr>
+            <w:r>
+              <w:rPr>
+                <w:b/>
+                <w:bCs/>
+                <w:i w:val="false"/>
+                <w:iCs w:val="false"/>
+                <w:strike w:val="false"/>
+                <w:color w:val="D14343"/>
+                <w:sz w:val="19"/>
+                <w:szCs w:val="19"/>
+              </w:rPr>
+              <w:t xml:space="preserve">9.880.000 đ</w:t>
             </w:r>
           </w:p>
         </w:tc>
@@ -480,249 +884,9 @@
       <w:tr>
         <w:tc>
           <w:tcPr>
-            <w:tcW w:type="dxa" w:w="1600"/>
-            <w:tcMar>
-              <w:top w:type="dxa" w:w="100"/>
-              <w:left w:type="dxa" w:w="100"/>
-              <w:bottom w:type="dxa" w:w="100"/>
-              <w:right w:type="dxa" w:w="100"/>
-            </w:tcMar>
-            <w:vAlign w:val="center"/>
-          </w:tcPr>
-          <w:p>
-            <w:pPr>
-              <w:jc w:val="left"/>
-            </w:pPr>
-            <w:r>
-              <w:rPr>
-                <w:b/>
-                <w:bCs/>
-                <w:i w:val="false"/>
-                <w:iCs w:val="false"/>
-                <w:color w:val="1C2035"/>
-                <w:sz w:val="19"/>
-                <w:szCs w:val="19"/>
-              </w:rPr>
-              <w:t xml:space="preserve">Dân Trí (dantri.com.vn)</w:t>
-            </w:r>
-          </w:p>
-        </w:tc>
-        <w:tc>
-          <w:tcPr>
-            <w:tcW w:type="dxa" w:w="2600"/>
-            <w:tcMar>
-              <w:top w:type="dxa" w:w="100"/>
-              <w:left w:type="dxa" w:w="100"/>
-              <w:bottom w:type="dxa" w:w="100"/>
-              <w:right w:type="dxa" w:w="100"/>
-            </w:tcMar>
-            <w:vAlign w:val="center"/>
-          </w:tcPr>
-          <w:p>
-            <w:pPr>
-              <w:jc w:val="left"/>
-            </w:pPr>
-            <w:r>
-              <w:rPr>
-                <w:b w:val="false"/>
-                <w:bCs w:val="false"/>
-                <w:i w:val="false"/>
-                <w:iCs w:val="false"/>
-                <w:color w:val="1C2035"/>
-                <w:sz w:val="19"/>
-                <w:szCs w:val="19"/>
-              </w:rPr>
-              <w:t xml:space="preserve">Tiểu mục nhóm 1 (Kinh doanh / Bất động sản)</w:t>
-            </w:r>
-          </w:p>
-        </w:tc>
-        <w:tc>
-          <w:tcPr>
-            <w:tcW w:type="dxa" w:w="3800"/>
-            <w:tcMar>
-              <w:top w:type="dxa" w:w="100"/>
-              <w:left w:type="dxa" w:w="100"/>
-              <w:bottom w:type="dxa" w:w="100"/>
-              <w:right w:type="dxa" w:w="100"/>
-            </w:tcMar>
-            <w:vAlign w:val="center"/>
-          </w:tcPr>
-          <w:p>
-            <w:pPr>
-              <w:jc w:val="left"/>
-            </w:pPr>
-            <w:r>
-              <w:rPr>
-                <w:b w:val="false"/>
-                <w:bCs w:val="false"/>
-                <w:i w:val="false"/>
-                <w:iCs w:val="false"/>
-                <w:color w:val="1C2035"/>
-                <w:sz w:val="19"/>
-                <w:szCs w:val="19"/>
-              </w:rPr>
-              <w:t xml:space="preserve">Bài dưới 1.000 từ, dưới 3 ảnh, mua thêm link 500k/link (gói 3 link 1 triệu)</w:t>
-            </w:r>
-          </w:p>
-        </w:tc>
-        <w:tc>
-          <w:tcPr>
-            <w:tcW w:type="dxa" w:w="2200"/>
-            <w:tcMar>
-              <w:top w:type="dxa" w:w="100"/>
-              <w:left w:type="dxa" w:w="100"/>
-              <w:bottom w:type="dxa" w:w="100"/>
-              <w:right w:type="dxa" w:w="100"/>
-            </w:tcMar>
-            <w:vAlign w:val="center"/>
-          </w:tcPr>
-          <w:p>
-            <w:pPr>
-              <w:jc w:val="right"/>
-            </w:pPr>
-            <w:r>
-              <w:rPr>
-                <w:b/>
-                <w:bCs/>
-                <w:i w:val="false"/>
-                <w:iCs w:val="false"/>
-                <w:color w:val="1C2035"/>
-                <w:sz w:val="19"/>
-                <w:szCs w:val="19"/>
-              </w:rPr>
-              <w:t xml:space="preserve">10.815.000 đ</w:t>
-            </w:r>
-          </w:p>
-        </w:tc>
-      </w:tr>
-      <w:tr>
-        <w:tc>
-          <w:tcPr>
-            <w:tcW w:type="dxa" w:w="1600"/>
-            <w:shd w:fill="F1F5F9" w:val="clear"/>
-            <w:tcMar>
-              <w:top w:type="dxa" w:w="100"/>
-              <w:left w:type="dxa" w:w="100"/>
-              <w:bottom w:type="dxa" w:w="100"/>
-              <w:right w:type="dxa" w:w="100"/>
-            </w:tcMar>
-            <w:vAlign w:val="center"/>
-          </w:tcPr>
-          <w:p>
-            <w:pPr>
-              <w:jc w:val="left"/>
-            </w:pPr>
-            <w:r>
-              <w:rPr>
-                <w:b/>
-                <w:bCs/>
-                <w:i w:val="false"/>
-                <w:iCs w:val="false"/>
-                <w:color w:val="1C2035"/>
-                <w:sz w:val="19"/>
-                <w:szCs w:val="19"/>
-              </w:rPr>
-              <w:t xml:space="preserve">CafeF.vn</w:t>
-            </w:r>
-          </w:p>
-        </w:tc>
-        <w:tc>
-          <w:tcPr>
-            <w:tcW w:type="dxa" w:w="2600"/>
-            <w:shd w:fill="F1F5F9" w:val="clear"/>
-            <w:tcMar>
-              <w:top w:type="dxa" w:w="100"/>
-              <w:left w:type="dxa" w:w="100"/>
-              <w:bottom w:type="dxa" w:w="100"/>
-              <w:right w:type="dxa" w:w="100"/>
-            </w:tcMar>
-            <w:vAlign w:val="center"/>
-          </w:tcPr>
-          <w:p>
-            <w:pPr>
-              <w:jc w:val="left"/>
-            </w:pPr>
-            <w:r>
-              <w:rPr>
-                <w:b w:val="false"/>
-                <w:bCs w:val="false"/>
-                <w:i w:val="false"/>
-                <w:iCs w:val="false"/>
-                <w:color w:val="1C2035"/>
-                <w:sz w:val="19"/>
-                <w:szCs w:val="19"/>
-              </w:rPr>
-              <w:t xml:space="preserve">Chuyên mục 1 (Bất động sản, Doanh nghiệp, Tài chính - Ngân hàng, Chứng khoán, Smart Money)</w:t>
-            </w:r>
-          </w:p>
-        </w:tc>
-        <w:tc>
-          <w:tcPr>
-            <w:tcW w:type="dxa" w:w="3800"/>
-            <w:shd w:fill="F1F5F9" w:val="clear"/>
-            <w:tcMar>
-              <w:top w:type="dxa" w:w="100"/>
-              <w:left w:type="dxa" w:w="100"/>
-              <w:bottom w:type="dxa" w:w="100"/>
-              <w:right w:type="dxa" w:w="100"/>
-            </w:tcMar>
-            <w:vAlign w:val="center"/>
-          </w:tcPr>
-          <w:p>
-            <w:pPr>
-              <w:jc w:val="left"/>
-            </w:pPr>
-            <w:r>
-              <w:rPr>
-                <w:b w:val="false"/>
-                <w:bCs w:val="false"/>
-                <w:i w:val="false"/>
-                <w:iCs w:val="false"/>
-                <w:color w:val="1C2035"/>
-                <w:sz w:val="19"/>
-                <w:szCs w:val="19"/>
-              </w:rPr>
-              <w:t xml:space="preserve">Bài dưới 1.000 từ, dưới 5 ảnh</w:t>
-            </w:r>
-          </w:p>
-        </w:tc>
-        <w:tc>
-          <w:tcPr>
-            <w:tcW w:type="dxa" w:w="2200"/>
-            <w:shd w:fill="F1F5F9" w:val="clear"/>
-            <w:tcMar>
-              <w:top w:type="dxa" w:w="100"/>
-              <w:left w:type="dxa" w:w="100"/>
-              <w:bottom w:type="dxa" w:w="100"/>
-              <w:right w:type="dxa" w:w="100"/>
-            </w:tcMar>
-            <w:vAlign w:val="center"/>
-          </w:tcPr>
-          <w:p>
-            <w:pPr>
-              <w:jc w:val="right"/>
-            </w:pPr>
-            <w:r>
-              <w:rPr>
-                <w:b/>
-                <w:bCs/>
-                <w:i w:val="false"/>
-                <w:iCs w:val="false"/>
-                <w:color w:val="1C2035"/>
-                <w:sz w:val="19"/>
-                <w:szCs w:val="19"/>
-              </w:rPr>
-              <w:t xml:space="preserve">10.712.000 đ</w:t>
-            </w:r>
-          </w:p>
-        </w:tc>
-      </w:tr>
-      <w:tr>
-        <w:tc>
-          <w:tcPr>
-            <w:tcW w:type="dxa" w:w="8000"/>
+            <w:tcW w:type="dxa" w:w="7100"/>
             <w:gridSpan w:val="3"/>
-            <w:shd w:fill="E8EEFB" w:val="clear"/>
+            <w:shd w:fill="FDEAEA" w:val="clear"/>
             <w:tcMar>
               <w:top w:type="dxa" w:w="120"/>
               <w:left w:type="dxa" w:w="100"/>
@@ -743,14 +907,15 @@
                 <w:sz w:val="21"/>
                 <w:szCs w:val="21"/>
               </w:rPr>
-              <w:t xml:space="preserve">TỔNG CỘNG (4 báo, chưa VAT)</w:t>
-            </w:r>
-          </w:p>
-        </w:tc>
-        <w:tc>
-          <w:tcPr>
-            <w:tcW w:type="dxa" w:w="2200"/>
-            <w:shd w:fill="E8EEFB" w:val="clear"/>
+              <w:t xml:space="preserve">TỔNG CỘNG (4 báo, ưu đãi 5%, chưa VAT)</w:t>
+            </w:r>
+          </w:p>
+        </w:tc>
+        <w:tc>
+          <w:tcPr>
+            <w:tcW w:type="dxa" w:w="3100"/>
+            <w:gridSpan w:val="2"/>
+            <w:shd w:fill="FDEAEA" w:val="clear"/>
             <w:tcMar>
               <w:top w:type="dxa" w:w="120"/>
               <w:left w:type="dxa" w:w="100"/>
@@ -767,11 +932,11 @@
               <w:rPr>
                 <w:b/>
                 <w:bCs/>
-                <w:color w:val="2563EB"/>
-                <w:sz w:val="22"/>
-                <w:szCs w:val="22"/>
-              </w:rPr>
-              <w:t xml:space="preserve">34.711.000 đ</w:t>
+                <w:color w:val="D14343"/>
+                <w:sz w:val="23"/>
+                <w:szCs w:val="23"/>
+              </w:rPr>
+              <w:t xml:space="preserve">32.015.000 đ</w:t>
             </w:r>
           </w:p>
         </w:tc>
@@ -779,7 +944,24 @@
     </w:tbl>
     <w:p>
       <w:pPr>
-        <w:spacing w:after="100" w:before="300"/>
+        <w:spacing w:after="100"/>
+      </w:pPr>
+      <w:r>
+        <w:rPr>
+          <w:b/>
+          <w:bCs/>
+          <w:i/>
+          <w:iCs/>
+          <w:color w:val="D14343"/>
+          <w:sz w:val="20"/>
+          <w:szCs w:val="20"/>
+        </w:rPr>
+        <w:t xml:space="preserve">Đã áp dụng ưu đãi 5% trên toàn bộ đơn hàng, tiết kiệm 1.685.000 đ so với giá gốc.</w:t>
+      </w:r>
+    </w:p>
+    <w:p>
+      <w:pPr>
+        <w:spacing w:after="100" w:before="260"/>
       </w:pPr>
       <w:r>
         <w:rPr>
@@ -806,7 +988,7 @@
           <w:sz w:val="19"/>
           <w:szCs w:val="19"/>
         </w:rPr>
-        <w:t xml:space="preserve">Bài trên VnExpress giữ 6 tháng trên site theo báo giá mặc định (không ảnh hưởng 3 báo còn lại — 3 báo này bài lưu lâu dài). Cần giữ bài lâu hơn để tăng hiệu quả SEO/backlink có thể nâng gói:</w:t>
+        <w:t xml:space="preserve">Bài trên VnExpress giữ 6 tháng trên site theo báo giá mặc định (không ảnh hưởng 3 báo còn lại — 3 báo này bài lưu lâu dài). Cần giữ bài lâu hơn để tăng hiệu quả SEO/backlink có thể nâng gói (giá đã tính ưu đãi 5%):</w:t>
       </w:r>
     </w:p>
     <w:tbl>
@@ -875,7 +1057,7 @@
                 <w:sz w:val="20"/>
                 <w:szCs w:val="20"/>
               </w:rPr>
-              <w:t xml:space="preserve">Đơn giá (chưa VAT)</w:t>
+              <w:t xml:space="preserve">Giá ưu đãi (chưa VAT)</w:t>
             </w:r>
           </w:p>
         </w:tc>
@@ -902,6 +1084,7 @@
                 <w:bCs/>
                 <w:i w:val="false"/>
                 <w:iCs w:val="false"/>
+                <w:strike w:val="false"/>
                 <w:color w:val="1C2035"/>
                 <w:sz w:val="19"/>
                 <w:szCs w:val="19"/>
@@ -931,11 +1114,12 @@
                 <w:bCs/>
                 <w:i w:val="false"/>
                 <w:iCs w:val="false"/>
+                <w:strike w:val="false"/>
                 <w:color w:val="1C2035"/>
                 <w:sz w:val="19"/>
                 <w:szCs w:val="19"/>
               </w:rPr>
-              <w:t xml:space="preserve">8.034.000 đ</w:t>
+              <w:t xml:space="preserve">7.410.000 đ</w:t>
             </w:r>
           </w:p>
         </w:tc>
@@ -963,6 +1147,7 @@
                 <w:bCs w:val="false"/>
                 <w:i w:val="false"/>
                 <w:iCs w:val="false"/>
+                <w:strike w:val="false"/>
                 <w:color w:val="1C2035"/>
                 <w:sz w:val="19"/>
                 <w:szCs w:val="19"/>
@@ -993,11 +1178,12 @@
                 <w:bCs/>
                 <w:i w:val="false"/>
                 <w:iCs w:val="false"/>
+                <w:strike w:val="false"/>
                 <w:color w:val="1C2035"/>
                 <w:sz w:val="19"/>
                 <w:szCs w:val="19"/>
               </w:rPr>
-              <w:t xml:space="preserve">12.154.000 đ</w:t>
+              <w:t xml:space="preserve">11.210.000 đ</w:t>
             </w:r>
           </w:p>
         </w:tc>
@@ -1024,6 +1210,7 @@
                 <w:bCs w:val="false"/>
                 <w:i w:val="false"/>
                 <w:iCs w:val="false"/>
+                <w:strike w:val="false"/>
                 <w:color w:val="1C2035"/>
                 <w:sz w:val="19"/>
                 <w:szCs w:val="19"/>
@@ -1053,11 +1240,12 @@
                 <w:bCs/>
                 <w:i w:val="false"/>
                 <w:iCs w:val="false"/>
+                <w:strike w:val="false"/>
                 <w:color w:val="1C2035"/>
                 <w:sz w:val="19"/>
                 <w:szCs w:val="19"/>
               </w:rPr>
-              <w:t xml:space="preserve">15.759.000 đ</w:t>
+              <w:t xml:space="preserve">14.535.000 đ</w:t>
             </w:r>
           </w:p>
         </w:tc>

</xml_diff>

<commit_message>
auto: session 2026-08-04 11:27
Co-Authored-By: Claude Opus 4.8 (1M context) <noreply@anthropic.com>
</commit_message>
<xml_diff>
--- a/11-bao-gia-khach/Bao-gia-Booking-PR-BDS-4-bao-2026-08-04.docx
+++ b/11-bao-gia-khach/Bao-gia-Booking-PR-BDS-4-bao-2026-08-04.docx
@@ -56,11 +56,11 @@
           <w:bCs/>
           <w:i w:val="false"/>
           <w:iCs w:val="false"/>
-          <w:color w:val="1C2035"/>
+          <w:color w:val="D14343"/>
           <w:sz w:val="22"/>
           <w:szCs w:val="22"/>
         </w:rPr>
-        <w:t xml:space="preserve">Dự án: Bất động sản  ·  Ưu đãi đặc biệt -5%</w:t>
+        <w:t xml:space="preserve">Dự án: Bất động sản  ·  Ưu đãi đến 34% so với giá niêm yết</w:t>
       </w:r>
     </w:p>
     <w:p>
@@ -127,11 +127,12 @@
         </w:tblBorders>
       </w:tblPr>
       <w:tblGrid>
-        <w:gridCol w:w="1600"/>
-        <w:gridCol w:w="2200"/>
-        <w:gridCol w:w="3300"/>
-        <w:gridCol w:w="1650"/>
-        <w:gridCol w:w="1450"/>
+        <w:gridCol w:w="1500"/>
+        <w:gridCol w:w="2000"/>
+        <w:gridCol w:w="2900"/>
+        <w:gridCol w:w="1500"/>
+        <w:gridCol w:w="900"/>
+        <w:gridCol w:w="1400"/>
       </w:tblGrid>
       <w:tr>
         <w:trPr>
@@ -139,7 +140,7 @@
         </w:trPr>
         <w:tc>
           <w:tcPr>
-            <w:tcW w:type="dxa" w:w="1600"/>
+            <w:tcW w:type="dxa" w:w="1500"/>
             <w:shd w:fill="1C2035" w:val="clear"/>
             <w:tcMar>
               <w:top w:type="dxa" w:w="100"/>
@@ -164,7 +165,7 @@
         </w:tc>
         <w:tc>
           <w:tcPr>
-            <w:tcW w:type="dxa" w:w="2200"/>
+            <w:tcW w:type="dxa" w:w="2000"/>
             <w:shd w:fill="1C2035" w:val="clear"/>
             <w:tcMar>
               <w:top w:type="dxa" w:w="100"/>
@@ -189,7 +190,7 @@
         </w:tc>
         <w:tc>
           <w:tcPr>
-            <w:tcW w:type="dxa" w:w="3300"/>
+            <w:tcW w:type="dxa" w:w="2900"/>
             <w:shd w:fill="1C2035" w:val="clear"/>
             <w:tcMar>
               <w:top w:type="dxa" w:w="100"/>
@@ -214,7 +215,7 @@
         </w:tc>
         <w:tc>
           <w:tcPr>
-            <w:tcW w:type="dxa" w:w="1650"/>
+            <w:tcW w:type="dxa" w:w="1500"/>
             <w:shd w:fill="1C2035" w:val="clear"/>
             <w:tcMar>
               <w:top w:type="dxa" w:w="100"/>
@@ -233,13 +234,13 @@
                 <w:sz w:val="20"/>
                 <w:szCs w:val="20"/>
               </w:rPr>
-              <w:t xml:space="preserve">Giá gốc</w:t>
-            </w:r>
-          </w:p>
-        </w:tc>
-        <w:tc>
-          <w:tcPr>
-            <w:tcW w:type="dxa" w:w="1450"/>
+              <w:t xml:space="preserve">Giá niêm yết</w:t>
+            </w:r>
+          </w:p>
+        </w:tc>
+        <w:tc>
+          <w:tcPr>
+            <w:tcW w:type="dxa" w:w="900"/>
             <w:shd w:fill="1C2035" w:val="clear"/>
             <w:tcMar>
               <w:top w:type="dxa" w:w="100"/>
@@ -258,7 +259,32 @@
                 <w:sz w:val="20"/>
                 <w:szCs w:val="20"/>
               </w:rPr>
-              <w:t xml:space="preserve">Ưu đãi -5%</w:t>
+              <w:t xml:space="preserve">Ưu đãi</w:t>
+            </w:r>
+          </w:p>
+        </w:tc>
+        <w:tc>
+          <w:tcPr>
+            <w:tcW w:type="dxa" w:w="1400"/>
+            <w:shd w:fill="1C2035" w:val="clear"/>
+            <w:tcMar>
+              <w:top w:type="dxa" w:w="100"/>
+              <w:left w:type="dxa" w:w="100"/>
+              <w:bottom w:type="dxa" w:w="100"/>
+              <w:right w:type="dxa" w:w="100"/>
+            </w:tcMar>
+            <w:vAlign w:val="center"/>
+          </w:tcPr>
+          <w:p>
+            <w:r>
+              <w:rPr>
+                <w:b/>
+                <w:bCs/>
+                <w:color w:val="FFFFFF"/>
+                <w:sz w:val="20"/>
+                <w:szCs w:val="20"/>
+              </w:rPr>
+              <w:t xml:space="preserve">Giá còn lại</w:t>
             </w:r>
           </w:p>
         </w:tc>
@@ -266,7 +292,7 @@
       <w:tr>
         <w:tc>
           <w:tcPr>
-            <w:tcW w:type="dxa" w:w="1600"/>
+            <w:tcW w:type="dxa" w:w="1500"/>
             <w:tcMar>
               <w:top w:type="dxa" w:w="100"/>
               <w:left w:type="dxa" w:w="100"/>
@@ -296,37 +322,7 @@
         </w:tc>
         <w:tc>
           <w:tcPr>
-            <w:tcW w:type="dxa" w:w="2200"/>
-            <w:tcMar>
-              <w:top w:type="dxa" w:w="100"/>
-              <w:left w:type="dxa" w:w="100"/>
-              <w:bottom w:type="dxa" w:w="100"/>
-              <w:right w:type="dxa" w:w="100"/>
-            </w:tcMar>
-            <w:vAlign w:val="center"/>
-          </w:tcPr>
-          <w:p>
-            <w:pPr>
-              <w:jc w:val="left"/>
-            </w:pPr>
-            <w:r>
-              <w:rPr>
-                <w:b w:val="false"/>
-                <w:bCs w:val="false"/>
-                <w:i w:val="false"/>
-                <w:iCs w:val="false"/>
-                <w:strike w:val="false"/>
-                <w:color w:val="1C2035"/>
-                <w:sz w:val="19"/>
-                <w:szCs w:val="19"/>
-              </w:rPr>
-              <w:t xml:space="preserve">Doanh nghiệp viết - tồn tại 6 tháng</w:t>
-            </w:r>
-          </w:p>
-        </w:tc>
-        <w:tc>
-          <w:tcPr>
-            <w:tcW w:type="dxa" w:w="3300"/>
+            <w:tcW w:type="dxa" w:w="2000"/>
             <w:tcMar>
               <w:top w:type="dxa" w:w="100"/>
               <w:left w:type="dxa" w:w="100"/>
@@ -350,13 +346,43 @@
                 <w:sz w:val="18"/>
                 <w:szCs w:val="18"/>
               </w:rPr>
+              <w:t xml:space="preserve">Doanh nghiệp viết - tồn tại 6 tháng</w:t>
+            </w:r>
+          </w:p>
+        </w:tc>
+        <w:tc>
+          <w:tcPr>
+            <w:tcW w:type="dxa" w:w="2900"/>
+            <w:tcMar>
+              <w:top w:type="dxa" w:w="100"/>
+              <w:left w:type="dxa" w:w="100"/>
+              <w:bottom w:type="dxa" w:w="100"/>
+              <w:right w:type="dxa" w:w="100"/>
+            </w:tcMar>
+            <w:vAlign w:val="center"/>
+          </w:tcPr>
+          <w:p>
+            <w:pPr>
+              <w:jc w:val="left"/>
+            </w:pPr>
+            <w:r>
+              <w:rPr>
+                <w:b w:val="false"/>
+                <w:bCs w:val="false"/>
+                <w:i w:val="false"/>
+                <w:iCs w:val="false"/>
+                <w:strike w:val="false"/>
+                <w:color w:val="1C2035"/>
+                <w:sz w:val="17"/>
+                <w:szCs w:val="17"/>
+              </w:rPr>
               <w:t xml:space="preserve">Bài dưới 1.000 từ, dưới 3 ảnh, 2 link no · bài lưu trên site 6 tháng kể từ ngày đăng</w:t>
             </w:r>
           </w:p>
         </w:tc>
         <w:tc>
           <w:tcPr>
-            <w:tcW w:type="dxa" w:w="1650"/>
+            <w:tcW w:type="dxa" w:w="1500"/>
             <w:tcMar>
               <w:top w:type="dxa" w:w="100"/>
               <w:left w:type="dxa" w:w="100"/>
@@ -380,13 +406,43 @@
                 <w:sz w:val="18"/>
                 <w:szCs w:val="18"/>
               </w:rPr>
-              <w:t xml:space="preserve">7.800.000 đ</w:t>
-            </w:r>
-          </w:p>
-        </w:tc>
-        <w:tc>
-          <w:tcPr>
-            <w:tcW w:type="dxa" w:w="1450"/>
+              <w:t xml:space="preserve">10.000.000 đ</w:t>
+            </w:r>
+          </w:p>
+        </w:tc>
+        <w:tc>
+          <w:tcPr>
+            <w:tcW w:type="dxa" w:w="900"/>
+            <w:tcMar>
+              <w:top w:type="dxa" w:w="100"/>
+              <w:left w:type="dxa" w:w="100"/>
+              <w:bottom w:type="dxa" w:w="100"/>
+              <w:right w:type="dxa" w:w="100"/>
+            </w:tcMar>
+            <w:vAlign w:val="center"/>
+          </w:tcPr>
+          <w:p>
+            <w:pPr>
+              <w:jc w:val="center"/>
+            </w:pPr>
+            <w:r>
+              <w:rPr>
+                <w:b/>
+                <w:bCs/>
+                <w:i w:val="false"/>
+                <w:iCs w:val="false"/>
+                <w:strike w:val="false"/>
+                <w:color w:val="0E8C7F"/>
+                <w:sz w:val="19"/>
+                <w:szCs w:val="19"/>
+              </w:rPr>
+              <w:t xml:space="preserve">-26%</w:t>
+            </w:r>
+          </w:p>
+        </w:tc>
+        <w:tc>
+          <w:tcPr>
+            <w:tcW w:type="dxa" w:w="1400"/>
             <w:tcMar>
               <w:top w:type="dxa" w:w="100"/>
               <w:left w:type="dxa" w:w="100"/>
@@ -418,7 +474,7 @@
       <w:tr>
         <w:tc>
           <w:tcPr>
-            <w:tcW w:type="dxa" w:w="1600"/>
+            <w:tcW w:type="dxa" w:w="1500"/>
             <w:shd w:fill="F1F5F9" w:val="clear"/>
             <w:tcMar>
               <w:top w:type="dxa" w:w="100"/>
@@ -449,38 +505,7 @@
         </w:tc>
         <w:tc>
           <w:tcPr>
-            <w:tcW w:type="dxa" w:w="2200"/>
-            <w:shd w:fill="F1F5F9" w:val="clear"/>
-            <w:tcMar>
-              <w:top w:type="dxa" w:w="100"/>
-              <w:left w:type="dxa" w:w="100"/>
-              <w:bottom w:type="dxa" w:w="100"/>
-              <w:right w:type="dxa" w:w="100"/>
-            </w:tcMar>
-            <w:vAlign w:val="center"/>
-          </w:tcPr>
-          <w:p>
-            <w:pPr>
-              <w:jc w:val="left"/>
-            </w:pPr>
-            <w:r>
-              <w:rPr>
-                <w:b w:val="false"/>
-                <w:bCs w:val="false"/>
-                <w:i w:val="false"/>
-                <w:iCs w:val="false"/>
-                <w:strike w:val="false"/>
-                <w:color w:val="1C2035"/>
-                <w:sz w:val="19"/>
-                <w:szCs w:val="19"/>
-              </w:rPr>
-              <w:t xml:space="preserve">Tiểu mục</w:t>
-            </w:r>
-          </w:p>
-        </w:tc>
-        <w:tc>
-          <w:tcPr>
-            <w:tcW w:type="dxa" w:w="3300"/>
+            <w:tcW w:type="dxa" w:w="2000"/>
             <w:shd w:fill="F1F5F9" w:val="clear"/>
             <w:tcMar>
               <w:top w:type="dxa" w:w="100"/>
@@ -505,13 +530,44 @@
                 <w:sz w:val="18"/>
                 <w:szCs w:val="18"/>
               </w:rPr>
+              <w:t xml:space="preserve">Tiểu mục</w:t>
+            </w:r>
+          </w:p>
+        </w:tc>
+        <w:tc>
+          <w:tcPr>
+            <w:tcW w:type="dxa" w:w="2900"/>
+            <w:shd w:fill="F1F5F9" w:val="clear"/>
+            <w:tcMar>
+              <w:top w:type="dxa" w:w="100"/>
+              <w:left w:type="dxa" w:w="100"/>
+              <w:bottom w:type="dxa" w:w="100"/>
+              <w:right w:type="dxa" w:w="100"/>
+            </w:tcMar>
+            <w:vAlign w:val="center"/>
+          </w:tcPr>
+          <w:p>
+            <w:pPr>
+              <w:jc w:val="left"/>
+            </w:pPr>
+            <w:r>
+              <w:rPr>
+                <w:b w:val="false"/>
+                <w:bCs w:val="false"/>
+                <w:i w:val="false"/>
+                <w:iCs w:val="false"/>
+                <w:strike w:val="false"/>
+                <w:color w:val="1C2035"/>
+                <w:sz w:val="17"/>
+                <w:szCs w:val="17"/>
+              </w:rPr>
               <w:t xml:space="preserve">Bài dưới 1.000 từ, dưới 3 ảnh · link no (nếu cần) tính thêm 5tr/3 tháng</w:t>
             </w:r>
           </w:p>
         </w:tc>
         <w:tc>
           <w:tcPr>
-            <w:tcW w:type="dxa" w:w="1650"/>
+            <w:tcW w:type="dxa" w:w="1500"/>
             <w:shd w:fill="F1F5F9" w:val="clear"/>
             <w:tcMar>
               <w:top w:type="dxa" w:w="100"/>
@@ -536,13 +592,44 @@
                 <w:sz w:val="18"/>
                 <w:szCs w:val="18"/>
               </w:rPr>
-              <w:t xml:space="preserve">5.000.000 đ</w:t>
-            </w:r>
-          </w:p>
-        </w:tc>
-        <w:tc>
-          <w:tcPr>
-            <w:tcW w:type="dxa" w:w="1450"/>
+              <w:t xml:space="preserve">6.000.000 đ</w:t>
+            </w:r>
+          </w:p>
+        </w:tc>
+        <w:tc>
+          <w:tcPr>
+            <w:tcW w:type="dxa" w:w="900"/>
+            <w:shd w:fill="F1F5F9" w:val="clear"/>
+            <w:tcMar>
+              <w:top w:type="dxa" w:w="100"/>
+              <w:left w:type="dxa" w:w="100"/>
+              <w:bottom w:type="dxa" w:w="100"/>
+              <w:right w:type="dxa" w:w="100"/>
+            </w:tcMar>
+            <w:vAlign w:val="center"/>
+          </w:tcPr>
+          <w:p>
+            <w:pPr>
+              <w:jc w:val="center"/>
+            </w:pPr>
+            <w:r>
+              <w:rPr>
+                <w:b/>
+                <w:bCs/>
+                <w:i w:val="false"/>
+                <w:iCs w:val="false"/>
+                <w:strike w:val="false"/>
+                <w:color w:val="0E8C7F"/>
+                <w:sz w:val="19"/>
+                <w:szCs w:val="19"/>
+              </w:rPr>
+              <w:t xml:space="preserve">-21%</w:t>
+            </w:r>
+          </w:p>
+        </w:tc>
+        <w:tc>
+          <w:tcPr>
+            <w:tcW w:type="dxa" w:w="1400"/>
             <w:shd w:fill="F1F5F9" w:val="clear"/>
             <w:tcMar>
               <w:top w:type="dxa" w:w="100"/>
@@ -575,7 +662,7 @@
       <w:tr>
         <w:tc>
           <w:tcPr>
-            <w:tcW w:type="dxa" w:w="1600"/>
+            <w:tcW w:type="dxa" w:w="1500"/>
             <w:tcMar>
               <w:top w:type="dxa" w:w="100"/>
               <w:left w:type="dxa" w:w="100"/>
@@ -605,37 +692,7 @@
         </w:tc>
         <w:tc>
           <w:tcPr>
-            <w:tcW w:type="dxa" w:w="2200"/>
-            <w:tcMar>
-              <w:top w:type="dxa" w:w="100"/>
-              <w:left w:type="dxa" w:w="100"/>
-              <w:bottom w:type="dxa" w:w="100"/>
-              <w:right w:type="dxa" w:w="100"/>
-            </w:tcMar>
-            <w:vAlign w:val="center"/>
-          </w:tcPr>
-          <w:p>
-            <w:pPr>
-              <w:jc w:val="left"/>
-            </w:pPr>
-            <w:r>
-              <w:rPr>
-                <w:b w:val="false"/>
-                <w:bCs w:val="false"/>
-                <w:i w:val="false"/>
-                <w:iCs w:val="false"/>
-                <w:strike w:val="false"/>
-                <w:color w:val="1C2035"/>
-                <w:sz w:val="19"/>
-                <w:szCs w:val="19"/>
-              </w:rPr>
-              <w:t xml:space="preserve">Tiểu mục nhóm 1 (Kinh doanh / Bất động sản)</w:t>
-            </w:r>
-          </w:p>
-        </w:tc>
-        <w:tc>
-          <w:tcPr>
-            <w:tcW w:type="dxa" w:w="3300"/>
+            <w:tcW w:type="dxa" w:w="2000"/>
             <w:tcMar>
               <w:top w:type="dxa" w:w="100"/>
               <w:left w:type="dxa" w:w="100"/>
@@ -659,13 +716,43 @@
                 <w:sz w:val="18"/>
                 <w:szCs w:val="18"/>
               </w:rPr>
+              <w:t xml:space="preserve">Tiểu mục nhóm 1 (Kinh doanh / Bất động sản)</w:t>
+            </w:r>
+          </w:p>
+        </w:tc>
+        <w:tc>
+          <w:tcPr>
+            <w:tcW w:type="dxa" w:w="2900"/>
+            <w:tcMar>
+              <w:top w:type="dxa" w:w="100"/>
+              <w:left w:type="dxa" w:w="100"/>
+              <w:bottom w:type="dxa" w:w="100"/>
+              <w:right w:type="dxa" w:w="100"/>
+            </w:tcMar>
+            <w:vAlign w:val="center"/>
+          </w:tcPr>
+          <w:p>
+            <w:pPr>
+              <w:jc w:val="left"/>
+            </w:pPr>
+            <w:r>
+              <w:rPr>
+                <w:b w:val="false"/>
+                <w:bCs w:val="false"/>
+                <w:i w:val="false"/>
+                <w:iCs w:val="false"/>
+                <w:strike w:val="false"/>
+                <w:color w:val="1C2035"/>
+                <w:sz w:val="17"/>
+                <w:szCs w:val="17"/>
+              </w:rPr>
               <w:t xml:space="preserve">Bài dưới 1.000 từ, dưới 3 ảnh, mua thêm link 500k/link (gói 3 link 1 triệu)</w:t>
             </w:r>
           </w:p>
         </w:tc>
         <w:tc>
           <w:tcPr>
-            <w:tcW w:type="dxa" w:w="1650"/>
+            <w:tcW w:type="dxa" w:w="1500"/>
             <w:tcMar>
               <w:top w:type="dxa" w:w="100"/>
               <w:left w:type="dxa" w:w="100"/>
@@ -689,13 +776,43 @@
                 <w:sz w:val="18"/>
                 <w:szCs w:val="18"/>
               </w:rPr>
-              <w:t xml:space="preserve">10.500.000 đ</w:t>
-            </w:r>
-          </w:p>
-        </w:tc>
-        <w:tc>
-          <w:tcPr>
-            <w:tcW w:type="dxa" w:w="1450"/>
+              <w:t xml:space="preserve">15.000.000 đ</w:t>
+            </w:r>
+          </w:p>
+        </w:tc>
+        <w:tc>
+          <w:tcPr>
+            <w:tcW w:type="dxa" w:w="900"/>
+            <w:tcMar>
+              <w:top w:type="dxa" w:w="100"/>
+              <w:left w:type="dxa" w:w="100"/>
+              <w:bottom w:type="dxa" w:w="100"/>
+              <w:right w:type="dxa" w:w="100"/>
+            </w:tcMar>
+            <w:vAlign w:val="center"/>
+          </w:tcPr>
+          <w:p>
+            <w:pPr>
+              <w:jc w:val="center"/>
+            </w:pPr>
+            <w:r>
+              <w:rPr>
+                <w:b/>
+                <w:bCs/>
+                <w:i w:val="false"/>
+                <w:iCs w:val="false"/>
+                <w:strike w:val="false"/>
+                <w:color w:val="0E8C7F"/>
+                <w:sz w:val="19"/>
+                <w:szCs w:val="19"/>
+              </w:rPr>
+              <w:t xml:space="preserve">-34%</w:t>
+            </w:r>
+          </w:p>
+        </w:tc>
+        <w:tc>
+          <w:tcPr>
+            <w:tcW w:type="dxa" w:w="1400"/>
             <w:tcMar>
               <w:top w:type="dxa" w:w="100"/>
               <w:left w:type="dxa" w:w="100"/>
@@ -727,7 +844,7 @@
       <w:tr>
         <w:tc>
           <w:tcPr>
-            <w:tcW w:type="dxa" w:w="1600"/>
+            <w:tcW w:type="dxa" w:w="1500"/>
             <w:shd w:fill="F1F5F9" w:val="clear"/>
             <w:tcMar>
               <w:top w:type="dxa" w:w="100"/>
@@ -758,38 +875,7 @@
         </w:tc>
         <w:tc>
           <w:tcPr>
-            <w:tcW w:type="dxa" w:w="2200"/>
-            <w:shd w:fill="F1F5F9" w:val="clear"/>
-            <w:tcMar>
-              <w:top w:type="dxa" w:w="100"/>
-              <w:left w:type="dxa" w:w="100"/>
-              <w:bottom w:type="dxa" w:w="100"/>
-              <w:right w:type="dxa" w:w="100"/>
-            </w:tcMar>
-            <w:vAlign w:val="center"/>
-          </w:tcPr>
-          <w:p>
-            <w:pPr>
-              <w:jc w:val="left"/>
-            </w:pPr>
-            <w:r>
-              <w:rPr>
-                <w:b w:val="false"/>
-                <w:bCs w:val="false"/>
-                <w:i w:val="false"/>
-                <w:iCs w:val="false"/>
-                <w:strike w:val="false"/>
-                <w:color w:val="1C2035"/>
-                <w:sz w:val="19"/>
-                <w:szCs w:val="19"/>
-              </w:rPr>
-              <w:t xml:space="preserve">Chuyên mục 1 (Bất động sản, Doanh nghiệp, Tài chính - Ngân hàng, Chứng khoán, Smart Money)</w:t>
-            </w:r>
-          </w:p>
-        </w:tc>
-        <w:tc>
-          <w:tcPr>
-            <w:tcW w:type="dxa" w:w="3300"/>
+            <w:tcW w:type="dxa" w:w="2000"/>
             <w:shd w:fill="F1F5F9" w:val="clear"/>
             <w:tcMar>
               <w:top w:type="dxa" w:w="100"/>
@@ -814,13 +900,44 @@
                 <w:sz w:val="18"/>
                 <w:szCs w:val="18"/>
               </w:rPr>
+              <w:t xml:space="preserve">Chuyên mục 1 (Bất động sản, Doanh nghiệp, Tài chính - Ngân hàng, Chứng khoán, Smart Money)</w:t>
+            </w:r>
+          </w:p>
+        </w:tc>
+        <w:tc>
+          <w:tcPr>
+            <w:tcW w:type="dxa" w:w="2900"/>
+            <w:shd w:fill="F1F5F9" w:val="clear"/>
+            <w:tcMar>
+              <w:top w:type="dxa" w:w="100"/>
+              <w:left w:type="dxa" w:w="100"/>
+              <w:bottom w:type="dxa" w:w="100"/>
+              <w:right w:type="dxa" w:w="100"/>
+            </w:tcMar>
+            <w:vAlign w:val="center"/>
+          </w:tcPr>
+          <w:p>
+            <w:pPr>
+              <w:jc w:val="left"/>
+            </w:pPr>
+            <w:r>
+              <w:rPr>
+                <w:b w:val="false"/>
+                <w:bCs w:val="false"/>
+                <w:i w:val="false"/>
+                <w:iCs w:val="false"/>
+                <w:strike w:val="false"/>
+                <w:color w:val="1C2035"/>
+                <w:sz w:val="17"/>
+                <w:szCs w:val="17"/>
+              </w:rPr>
               <w:t xml:space="preserve">Bài dưới 1.000 từ, dưới 5 ảnh</w:t>
             </w:r>
           </w:p>
         </w:tc>
         <w:tc>
           <w:tcPr>
-            <w:tcW w:type="dxa" w:w="1650"/>
+            <w:tcW w:type="dxa" w:w="1500"/>
             <w:shd w:fill="F1F5F9" w:val="clear"/>
             <w:tcMar>
               <w:top w:type="dxa" w:w="100"/>
@@ -845,13 +962,44 @@
                 <w:sz w:val="18"/>
                 <w:szCs w:val="18"/>
               </w:rPr>
-              <w:t xml:space="preserve">10.400.000 đ</w:t>
-            </w:r>
-          </w:p>
-        </w:tc>
-        <w:tc>
-          <w:tcPr>
-            <w:tcW w:type="dxa" w:w="1450"/>
+              <w:t xml:space="preserve">12.000.000 đ</w:t>
+            </w:r>
+          </w:p>
+        </w:tc>
+        <w:tc>
+          <w:tcPr>
+            <w:tcW w:type="dxa" w:w="900"/>
+            <w:shd w:fill="F1F5F9" w:val="clear"/>
+            <w:tcMar>
+              <w:top w:type="dxa" w:w="100"/>
+              <w:left w:type="dxa" w:w="100"/>
+              <w:bottom w:type="dxa" w:w="100"/>
+              <w:right w:type="dxa" w:w="100"/>
+            </w:tcMar>
+            <w:vAlign w:val="center"/>
+          </w:tcPr>
+          <w:p>
+            <w:pPr>
+              <w:jc w:val="center"/>
+            </w:pPr>
+            <w:r>
+              <w:rPr>
+                <w:b/>
+                <w:bCs/>
+                <w:i w:val="false"/>
+                <w:iCs w:val="false"/>
+                <w:strike w:val="false"/>
+                <w:color w:val="0E8C7F"/>
+                <w:sz w:val="19"/>
+                <w:szCs w:val="19"/>
+              </w:rPr>
+              <w:t xml:space="preserve">-18%</w:t>
+            </w:r>
+          </w:p>
+        </w:tc>
+        <w:tc>
+          <w:tcPr>
+            <w:tcW w:type="dxa" w:w="1400"/>
             <w:shd w:fill="F1F5F9" w:val="clear"/>
             <w:tcMar>
               <w:top w:type="dxa" w:w="100"/>
@@ -884,8 +1032,8 @@
       <w:tr>
         <w:tc>
           <w:tcPr>
-            <w:tcW w:type="dxa" w:w="7100"/>
-            <w:gridSpan w:val="3"/>
+            <w:tcW w:type="dxa" w:w="7900"/>
+            <w:gridSpan w:val="4"/>
             <w:shd w:fill="FDEAEA" w:val="clear"/>
             <w:tcMar>
               <w:top w:type="dxa" w:w="120"/>
@@ -907,13 +1055,13 @@
                 <w:sz w:val="21"/>
                 <w:szCs w:val="21"/>
               </w:rPr>
-              <w:t xml:space="preserve">TỔNG CỘNG (4 báo, ưu đãi 5%, chưa VAT)</w:t>
-            </w:r>
-          </w:p>
-        </w:tc>
-        <w:tc>
-          <w:tcPr>
-            <w:tcW w:type="dxa" w:w="3100"/>
+              <w:t xml:space="preserve">TỔNG CỘNG (4 báo, ưu đãi TB 26%, chưa VAT)</w:t>
+            </w:r>
+          </w:p>
+        </w:tc>
+        <w:tc>
+          <w:tcPr>
+            <w:tcW w:type="dxa" w:w="2300"/>
             <w:gridSpan w:val="2"/>
             <w:shd w:fill="FDEAEA" w:val="clear"/>
             <w:tcMar>
@@ -956,7 +1104,7 @@
           <w:sz w:val="20"/>
           <w:szCs w:val="20"/>
         </w:rPr>
-        <w:t xml:space="preserve">Đã áp dụng ưu đãi 5% trên toàn bộ đơn hàng, tiết kiệm 1.685.000 đ so với giá gốc.</w:t>
+        <w:t xml:space="preserve">Ưu đãi trung bình 26% so với giá niêm yết, tiết kiệm 10.985.000 đ cho toàn bộ đơn hàng.</w:t>
       </w:r>
     </w:p>
     <w:p>
@@ -988,7 +1136,7 @@
           <w:sz w:val="19"/>
           <w:szCs w:val="19"/>
         </w:rPr>
-        <w:t xml:space="preserve">Bài trên VnExpress giữ 6 tháng trên site theo báo giá mặc định (không ảnh hưởng 3 báo còn lại — 3 báo này bài lưu lâu dài). Cần giữ bài lâu hơn để tăng hiệu quả SEO/backlink có thể nâng gói (giá đã tính ưu đãi 5%):</w:t>
+        <w:t xml:space="preserve">Bài trên VnExpress giữ 6 tháng trên site theo báo giá mặc định (không ảnh hưởng 3 báo còn lại — 3 báo này bài lưu lâu dài). Cần giữ bài lâu hơn để tăng hiệu quả SEO/backlink có thể nâng gói:</w:t>
       </w:r>
     </w:p>
     <w:tbl>
@@ -1004,8 +1152,10 @@
         </w:tblBorders>
       </w:tblPr>
       <w:tblGrid>
-        <w:gridCol w:w="5000"/>
-        <w:gridCol w:w="5200"/>
+        <w:gridCol w:w="3600"/>
+        <w:gridCol w:w="2400"/>
+        <w:gridCol w:w="1600"/>
+        <w:gridCol w:w="2600"/>
       </w:tblGrid>
       <w:tr>
         <w:trPr>
@@ -1013,7 +1163,7 @@
         </w:trPr>
         <w:tc>
           <w:tcPr>
-            <w:tcW w:type="dxa" w:w="5000"/>
+            <w:tcW w:type="dxa" w:w="3600"/>
             <w:shd w:fill="1C2035" w:val="clear"/>
             <w:tcMar>
               <w:top w:type="dxa" w:w="100"/>
@@ -1038,7 +1188,7 @@
         </w:tc>
         <w:tc>
           <w:tcPr>
-            <w:tcW w:type="dxa" w:w="5200"/>
+            <w:tcW w:type="dxa" w:w="2400"/>
             <w:shd w:fill="1C2035" w:val="clear"/>
             <w:tcMar>
               <w:top w:type="dxa" w:w="100"/>
@@ -1057,7 +1207,57 @@
                 <w:sz w:val="20"/>
                 <w:szCs w:val="20"/>
               </w:rPr>
-              <w:t xml:space="preserve">Giá ưu đãi (chưa VAT)</w:t>
+              <w:t xml:space="preserve">Giá niêm yết</w:t>
+            </w:r>
+          </w:p>
+        </w:tc>
+        <w:tc>
+          <w:tcPr>
+            <w:tcW w:type="dxa" w:w="1600"/>
+            <w:shd w:fill="1C2035" w:val="clear"/>
+            <w:tcMar>
+              <w:top w:type="dxa" w:w="100"/>
+              <w:left w:type="dxa" w:w="100"/>
+              <w:bottom w:type="dxa" w:w="100"/>
+              <w:right w:type="dxa" w:w="100"/>
+            </w:tcMar>
+            <w:vAlign w:val="center"/>
+          </w:tcPr>
+          <w:p>
+            <w:r>
+              <w:rPr>
+                <w:b/>
+                <w:bCs/>
+                <w:color w:val="FFFFFF"/>
+                <w:sz w:val="20"/>
+                <w:szCs w:val="20"/>
+              </w:rPr>
+              <w:t xml:space="preserve">Ưu đãi</w:t>
+            </w:r>
+          </w:p>
+        </w:tc>
+        <w:tc>
+          <w:tcPr>
+            <w:tcW w:type="dxa" w:w="2600"/>
+            <w:shd w:fill="1C2035" w:val="clear"/>
+            <w:tcMar>
+              <w:top w:type="dxa" w:w="100"/>
+              <w:left w:type="dxa" w:w="100"/>
+              <w:bottom w:type="dxa" w:w="100"/>
+              <w:right w:type="dxa" w:w="100"/>
+            </w:tcMar>
+            <w:vAlign w:val="center"/>
+          </w:tcPr>
+          <w:p>
+            <w:r>
+              <w:rPr>
+                <w:b/>
+                <w:bCs/>
+                <w:color w:val="FFFFFF"/>
+                <w:sz w:val="20"/>
+                <w:szCs w:val="20"/>
+              </w:rPr>
+              <w:t xml:space="preserve">Giá còn lại</w:t>
             </w:r>
           </w:p>
         </w:tc>
@@ -1065,7 +1265,7 @@
       <w:tr>
         <w:tc>
           <w:tcPr>
-            <w:tcW w:type="dxa" w:w="5000"/>
+            <w:tcW w:type="dxa" w:w="3600"/>
             <w:tcMar>
               <w:top w:type="dxa" w:w="100"/>
               <w:left w:type="dxa" w:w="100"/>
@@ -1095,7 +1295,7 @@
         </w:tc>
         <w:tc>
           <w:tcPr>
-            <w:tcW w:type="dxa" w:w="5200"/>
+            <w:tcW w:type="dxa" w:w="2400"/>
             <w:tcMar>
               <w:top w:type="dxa" w:w="100"/>
               <w:left w:type="dxa" w:w="100"/>
@@ -1110,8 +1310,101 @@
             </w:pPr>
             <w:r>
               <w:rPr>
-                <w:b/>
-                <w:bCs/>
+                <w:b w:val="false"/>
+                <w:bCs w:val="false"/>
+                <w:i w:val="false"/>
+                <w:iCs w:val="false"/>
+                <w:strike/>
+                <w:color w:val="8A94A3"/>
+                <w:sz w:val="18"/>
+                <w:szCs w:val="18"/>
+              </w:rPr>
+              <w:t xml:space="preserve">10.000.000 đ</w:t>
+            </w:r>
+          </w:p>
+        </w:tc>
+        <w:tc>
+          <w:tcPr>
+            <w:tcW w:type="dxa" w:w="1600"/>
+            <w:tcMar>
+              <w:top w:type="dxa" w:w="100"/>
+              <w:left w:type="dxa" w:w="100"/>
+              <w:bottom w:type="dxa" w:w="100"/>
+              <w:right w:type="dxa" w:w="100"/>
+            </w:tcMar>
+            <w:vAlign w:val="center"/>
+          </w:tcPr>
+          <w:p>
+            <w:pPr>
+              <w:jc w:val="center"/>
+            </w:pPr>
+            <w:r>
+              <w:rPr>
+                <w:b/>
+                <w:bCs/>
+                <w:i w:val="false"/>
+                <w:iCs w:val="false"/>
+                <w:strike w:val="false"/>
+                <w:color w:val="0E8C7F"/>
+                <w:sz w:val="19"/>
+                <w:szCs w:val="19"/>
+              </w:rPr>
+              <w:t xml:space="preserve">-26%</w:t>
+            </w:r>
+          </w:p>
+        </w:tc>
+        <w:tc>
+          <w:tcPr>
+            <w:tcW w:type="dxa" w:w="2600"/>
+            <w:tcMar>
+              <w:top w:type="dxa" w:w="100"/>
+              <w:left w:type="dxa" w:w="100"/>
+              <w:bottom w:type="dxa" w:w="100"/>
+              <w:right w:type="dxa" w:w="100"/>
+            </w:tcMar>
+            <w:vAlign w:val="center"/>
+          </w:tcPr>
+          <w:p>
+            <w:pPr>
+              <w:jc w:val="right"/>
+            </w:pPr>
+            <w:r>
+              <w:rPr>
+                <w:b/>
+                <w:bCs/>
+                <w:i w:val="false"/>
+                <w:iCs w:val="false"/>
+                <w:strike w:val="false"/>
+                <w:color w:val="D14343"/>
+                <w:sz w:val="19"/>
+                <w:szCs w:val="19"/>
+              </w:rPr>
+              <w:t xml:space="preserve">7.410.000 đ</w:t>
+            </w:r>
+          </w:p>
+        </w:tc>
+      </w:tr>
+      <w:tr>
+        <w:tc>
+          <w:tcPr>
+            <w:tcW w:type="dxa" w:w="3600"/>
+            <w:shd w:fill="F1F5F9" w:val="clear"/>
+            <w:tcMar>
+              <w:top w:type="dxa" w:w="100"/>
+              <w:left w:type="dxa" w:w="100"/>
+              <w:bottom w:type="dxa" w:w="100"/>
+              <w:right w:type="dxa" w:w="100"/>
+            </w:tcMar>
+            <w:vAlign w:val="center"/>
+          </w:tcPr>
+          <w:p>
+            <w:pPr>
+              <w:jc w:val="left"/>
+            </w:pPr>
+            <w:r>
+              <w:rPr>
+                <w:b w:val="false"/>
+                <w:bCs w:val="false"/>
                 <w:i w:val="false"/>
                 <w:iCs w:val="false"/>
                 <w:strike w:val="false"/>
@@ -1119,7 +1412,100 @@
                 <w:sz w:val="19"/>
                 <w:szCs w:val="19"/>
               </w:rPr>
-              <w:t xml:space="preserve">7.410.000 đ</w:t>
+              <w:t xml:space="preserve">24 tháng</w:t>
+            </w:r>
+          </w:p>
+        </w:tc>
+        <w:tc>
+          <w:tcPr>
+            <w:tcW w:type="dxa" w:w="2400"/>
+            <w:shd w:fill="F1F5F9" w:val="clear"/>
+            <w:tcMar>
+              <w:top w:type="dxa" w:w="100"/>
+              <w:left w:type="dxa" w:w="100"/>
+              <w:bottom w:type="dxa" w:w="100"/>
+              <w:right w:type="dxa" w:w="100"/>
+            </w:tcMar>
+            <w:vAlign w:val="center"/>
+          </w:tcPr>
+          <w:p>
+            <w:pPr>
+              <w:jc w:val="right"/>
+            </w:pPr>
+            <w:r>
+              <w:rPr>
+                <w:b w:val="false"/>
+                <w:bCs w:val="false"/>
+                <w:i w:val="false"/>
+                <w:iCs w:val="false"/>
+                <w:strike/>
+                <w:color w:val="8A94A3"/>
+                <w:sz w:val="18"/>
+                <w:szCs w:val="18"/>
+              </w:rPr>
+              <w:t xml:space="preserve">15.000.000 đ</w:t>
+            </w:r>
+          </w:p>
+        </w:tc>
+        <w:tc>
+          <w:tcPr>
+            <w:tcW w:type="dxa" w:w="1600"/>
+            <w:shd w:fill="F1F5F9" w:val="clear"/>
+            <w:tcMar>
+              <w:top w:type="dxa" w:w="100"/>
+              <w:left w:type="dxa" w:w="100"/>
+              <w:bottom w:type="dxa" w:w="100"/>
+              <w:right w:type="dxa" w:w="100"/>
+            </w:tcMar>
+            <w:vAlign w:val="center"/>
+          </w:tcPr>
+          <w:p>
+            <w:pPr>
+              <w:jc w:val="center"/>
+            </w:pPr>
+            <w:r>
+              <w:rPr>
+                <w:b/>
+                <w:bCs/>
+                <w:i w:val="false"/>
+                <w:iCs w:val="false"/>
+                <w:strike w:val="false"/>
+                <w:color w:val="0E8C7F"/>
+                <w:sz w:val="19"/>
+                <w:szCs w:val="19"/>
+              </w:rPr>
+              <w:t xml:space="preserve">-25%</w:t>
+            </w:r>
+          </w:p>
+        </w:tc>
+        <w:tc>
+          <w:tcPr>
+            <w:tcW w:type="dxa" w:w="2600"/>
+            <w:shd w:fill="F1F5F9" w:val="clear"/>
+            <w:tcMar>
+              <w:top w:type="dxa" w:w="100"/>
+              <w:left w:type="dxa" w:w="100"/>
+              <w:bottom w:type="dxa" w:w="100"/>
+              <w:right w:type="dxa" w:w="100"/>
+            </w:tcMar>
+            <w:vAlign w:val="center"/>
+          </w:tcPr>
+          <w:p>
+            <w:pPr>
+              <w:jc w:val="right"/>
+            </w:pPr>
+            <w:r>
+              <w:rPr>
+                <w:b/>
+                <w:bCs/>
+                <w:i w:val="false"/>
+                <w:iCs w:val="false"/>
+                <w:strike w:val="false"/>
+                <w:color w:val="D14343"/>
+                <w:sz w:val="19"/>
+                <w:szCs w:val="19"/>
+              </w:rPr>
+              <w:t xml:space="preserve">11.210.000 đ</w:t>
             </w:r>
           </w:p>
         </w:tc>
@@ -1127,8 +1513,7 @@
       <w:tr>
         <w:tc>
           <w:tcPr>
-            <w:tcW w:type="dxa" w:w="5000"/>
-            <w:shd w:fill="F1F5F9" w:val="clear"/>
+            <w:tcW w:type="dxa" w:w="3600"/>
             <w:tcMar>
               <w:top w:type="dxa" w:w="100"/>
               <w:left w:type="dxa" w:w="100"/>
@@ -1152,14 +1537,13 @@
                 <w:sz w:val="19"/>
                 <w:szCs w:val="19"/>
               </w:rPr>
-              <w:t xml:space="preserve">24 tháng</w:t>
-            </w:r>
-          </w:p>
-        </w:tc>
-        <w:tc>
-          <w:tcPr>
-            <w:tcW w:type="dxa" w:w="5200"/>
-            <w:shd w:fill="F1F5F9" w:val="clear"/>
+              <w:t xml:space="preserve">Vĩnh viễn (tồn tại theo domain)</w:t>
+            </w:r>
+          </w:p>
+        </w:tc>
+        <w:tc>
+          <w:tcPr>
+            <w:tcW w:type="dxa" w:w="2400"/>
             <w:tcMar>
               <w:top w:type="dxa" w:w="100"/>
               <w:left w:type="dxa" w:w="100"/>
@@ -1174,54 +1558,52 @@
             </w:pPr>
             <w:r>
               <w:rPr>
-                <w:b/>
-                <w:bCs/>
-                <w:i w:val="false"/>
-                <w:iCs w:val="false"/>
-                <w:strike w:val="false"/>
-                <w:color w:val="1C2035"/>
+                <w:b w:val="false"/>
+                <w:bCs w:val="false"/>
+                <w:i w:val="false"/>
+                <w:iCs w:val="false"/>
+                <w:strike/>
+                <w:color w:val="8A94A3"/>
+                <w:sz w:val="18"/>
+                <w:szCs w:val="18"/>
+              </w:rPr>
+              <w:t xml:space="preserve">20.000.000 đ</w:t>
+            </w:r>
+          </w:p>
+        </w:tc>
+        <w:tc>
+          <w:tcPr>
+            <w:tcW w:type="dxa" w:w="1600"/>
+            <w:tcMar>
+              <w:top w:type="dxa" w:w="100"/>
+              <w:left w:type="dxa" w:w="100"/>
+              <w:bottom w:type="dxa" w:w="100"/>
+              <w:right w:type="dxa" w:w="100"/>
+            </w:tcMar>
+            <w:vAlign w:val="center"/>
+          </w:tcPr>
+          <w:p>
+            <w:pPr>
+              <w:jc w:val="center"/>
+            </w:pPr>
+            <w:r>
+              <w:rPr>
+                <w:b/>
+                <w:bCs/>
+                <w:i w:val="false"/>
+                <w:iCs w:val="false"/>
+                <w:strike w:val="false"/>
+                <w:color w:val="0E8C7F"/>
                 <w:sz w:val="19"/>
                 <w:szCs w:val="19"/>
               </w:rPr>
-              <w:t xml:space="preserve">11.210.000 đ</w:t>
-            </w:r>
-          </w:p>
-        </w:tc>
-      </w:tr>
-      <w:tr>
-        <w:tc>
-          <w:tcPr>
-            <w:tcW w:type="dxa" w:w="5000"/>
-            <w:tcMar>
-              <w:top w:type="dxa" w:w="100"/>
-              <w:left w:type="dxa" w:w="100"/>
-              <w:bottom w:type="dxa" w:w="100"/>
-              <w:right w:type="dxa" w:w="100"/>
-            </w:tcMar>
-            <w:vAlign w:val="center"/>
-          </w:tcPr>
-          <w:p>
-            <w:pPr>
-              <w:jc w:val="left"/>
-            </w:pPr>
-            <w:r>
-              <w:rPr>
-                <w:b w:val="false"/>
-                <w:bCs w:val="false"/>
-                <w:i w:val="false"/>
-                <w:iCs w:val="false"/>
-                <w:strike w:val="false"/>
-                <w:color w:val="1C2035"/>
-                <w:sz w:val="19"/>
-                <w:szCs w:val="19"/>
-              </w:rPr>
-              <w:t xml:space="preserve">Vĩnh viễn (tồn tại theo domain)</w:t>
-            </w:r>
-          </w:p>
-        </w:tc>
-        <w:tc>
-          <w:tcPr>
-            <w:tcW w:type="dxa" w:w="5200"/>
+              <w:t xml:space="preserve">-27%</w:t>
+            </w:r>
+          </w:p>
+        </w:tc>
+        <w:tc>
+          <w:tcPr>
+            <w:tcW w:type="dxa" w:w="2600"/>
             <w:tcMar>
               <w:top w:type="dxa" w:w="100"/>
               <w:left w:type="dxa" w:w="100"/>
@@ -1241,7 +1623,7 @@
                 <w:i w:val="false"/>
                 <w:iCs w:val="false"/>
                 <w:strike w:val="false"/>
-                <w:color w:val="1C2035"/>
+                <w:color w:val="D14343"/>
                 <w:sz w:val="19"/>
                 <w:szCs w:val="19"/>
               </w:rPr>
@@ -1281,7 +1663,7 @@
           <w:sz w:val="20"/>
           <w:szCs w:val="20"/>
         </w:rPr>
-        <w:t xml:space="preserve">Giá trên là giá tham khảo, chưa bao gồm VAT 8%, có thể thay đổi vào phút chót theo báo giá thực tế từ toà soạn.</w:t>
+        <w:t xml:space="preserve">Giá niêm yết là giá công bố của toà soạn trước chiết khấu; giá còn lại là giá thực thu sau ưu đãi, chưa bao gồm VAT 8%.</w:t>
       </w:r>
     </w:p>
     <w:p>
@@ -1299,7 +1681,7 @@
           <w:sz w:val="20"/>
           <w:szCs w:val="20"/>
         </w:rPr>
-        <w:t xml:space="preserve">Cần đầy đủ giấy tờ pháp lý công ty/dự án (giấy phép kinh doanh, quyết định phê duyệt dự án hoặc giấy tờ liên quan) để toà soạn duyệt nội dung PR.</w:t>
+        <w:t xml:space="preserve">Giá có thể thay đổi vào phút chót theo báo giá thực tế từ toà soạn.</w:t>
       </w:r>
     </w:p>
     <w:p>
@@ -1317,7 +1699,7 @@
           <w:sz w:val="20"/>
           <w:szCs w:val="20"/>
         </w:rPr>
-        <w:t xml:space="preserve">Nội dung bài viết do Digicom hỗ trợ biên tập theo đúng văn phong báo chí, tuân thủ yêu cầu biên tập của từng báo (độ dài, số ảnh, số link nêu ở cột Quy cách).</w:t>
+        <w:t xml:space="preserve">Cần đầy đủ giấy tờ pháp lý công ty/dự án (giấy phép kinh doanh, quyết định phê duyệt dự án hoặc giấy tờ liên quan) để toà soạn duyệt nội dung PR.</w:t>
       </w:r>
     </w:p>
     <w:p>
@@ -1335,7 +1717,7 @@
           <w:sz w:val="20"/>
           <w:szCs w:val="20"/>
         </w:rPr>
-        <w:t xml:space="preserve">Thời gian duyệt bài: 1-3 ngày làm việc tuỳ báo, kể từ khi nhận đủ nội dung và giấy tờ.</w:t>
+        <w:t xml:space="preserve">Nội dung bài viết do Digicom hỗ trợ biên tập theo đúng văn phong báo chí, tuân thủ yêu cầu biên tập của từng báo (độ dài, số ảnh, số link nêu ở cột Quy cách).</w:t>
       </w:r>
     </w:p>
     <w:p>
@@ -1353,7 +1735,7 @@
           <w:sz w:val="20"/>
           <w:szCs w:val="20"/>
         </w:rPr>
-        <w:t xml:space="preserve">Có thể nâng vị trí đăng (trang chủ, box nổi bật...) theo yêu cầu — báo giá riêng cho từng vị trí nâng cấp.</w:t>
+        <w:t xml:space="preserve">Thời gian duyệt bài: 1-3 ngày làm việc tuỳ báo, kể từ khi nhận đủ nội dung và giấy tờ.</w:t>
       </w:r>
     </w:p>
     <w:p>

</xml_diff>